<commit_message>
Prepare Case 1 report for technical defense
Co-authored-by: Copilot <223556219+Copilot@users.noreply.github.com>
</commit_message>
<xml_diff>
--- a/Caso1/docs/INFORME_PRESENTACION_CASO_1.docx
+++ b/Caso1/docs/INFORME_PRESENTACION_CASO_1.docx
@@ -13,6 +13,143 @@
           <w:i w:val="0"/>
         </w:rPr>
         <w:t>Informe de presentación — Caso 1: EducaVault</w:t>
+      </w:r>
+    </w:p>
+    <w:p>
+      <w:pPr>
+        <w:spacing w:after="60"/>
+        <w:jc w:val="center"/>
+      </w:pPr>
+      <w:r>
+        <w:rPr>
+          <w:b/>
+          <w:i w:val="0"/>
+        </w:rPr>
+        <w:t>Universidad Adventista de Bolivia · Ingeniería de Sistemas</w:t>
+      </w:r>
+    </w:p>
+    <w:p>
+      <w:pPr>
+        <w:spacing w:after="60"/>
+        <w:jc w:val="center"/>
+      </w:pPr>
+      <w:r>
+        <w:rPr>
+          <w:b/>
+          <w:i w:val="0"/>
+        </w:rPr>
+        <w:t>Asignatura:</w:t>
+      </w:r>
+      <w:r>
+        <w:rPr>
+          <w:b w:val="0"/>
+          <w:i w:val="0"/>
+        </w:rPr>
+        <w:t xml:space="preserve"> Tecnologías en Internet · </w:t>
+      </w:r>
+      <w:r>
+        <w:rPr>
+          <w:b/>
+          <w:i w:val="0"/>
+        </w:rPr>
+        <w:t>Semestre:</w:t>
+      </w:r>
+      <w:r>
+        <w:rPr>
+          <w:b w:val="0"/>
+          <w:i w:val="0"/>
+        </w:rPr>
+        <w:t xml:space="preserve"> 6.º</w:t>
+      </w:r>
+    </w:p>
+    <w:p>
+      <w:pPr>
+        <w:spacing w:after="60"/>
+        <w:jc w:val="center"/>
+      </w:pPr>
+      <w:r>
+        <w:rPr>
+          <w:b/>
+          <w:i w:val="0"/>
+        </w:rPr>
+        <w:t>Docente:</w:t>
+      </w:r>
+      <w:r>
+        <w:rPr>
+          <w:b w:val="0"/>
+          <w:i w:val="0"/>
+        </w:rPr>
+        <w:t xml:space="preserve"> Víctor Hugo Sarzuri Flores</w:t>
+      </w:r>
+    </w:p>
+    <w:p>
+      <w:pPr>
+        <w:spacing w:after="60"/>
+        <w:jc w:val="center"/>
+      </w:pPr>
+      <w:r>
+        <w:rPr>
+          <w:b/>
+          <w:i w:val="0"/>
+        </w:rPr>
+        <w:t>Estudiante:</w:t>
+      </w:r>
+      <w:r>
+        <w:rPr>
+          <w:b w:val="0"/>
+          <w:i w:val="0"/>
+        </w:rPr>
+        <w:t xml:space="preserve"> Eva Lizeth Chino Quispe</w:t>
+      </w:r>
+    </w:p>
+    <w:p>
+      <w:pPr>
+        <w:spacing w:after="60"/>
+        <w:jc w:val="center"/>
+      </w:pPr>
+      <w:r>
+        <w:rPr>
+          <w:b/>
+          <w:i w:val="0"/>
+        </w:rPr>
+        <w:t>Fecha de presentación:</w:t>
+      </w:r>
+      <w:r>
+        <w:rPr>
+          <w:b w:val="0"/>
+          <w:i w:val="0"/>
+        </w:rPr>
+        <w:t xml:space="preserve"> 21 de octubre de 2026</w:t>
+      </w:r>
+    </w:p>
+    <w:p>
+      <w:pPr>
+        <w:spacing w:after="60"/>
+        <w:jc w:val="center"/>
+      </w:pPr>
+      <w:r>
+        <w:rPr>
+          <w:b w:val="0"/>
+          <w:i w:val="0"/>
+        </w:rPr>
+        <w:t xml:space="preserve">Evidencias capturadas durante la ejecución en la carpeta </w:t>
+      </w:r>
+      <w:r>
+        <w:rPr>
+          <w:rFonts w:ascii="Consolas" w:hAnsi="Consolas"/>
+          <w:b w:val="0"/>
+          <w:i w:val="0"/>
+          <w:color w:val="167C80"/>
+          <w:sz w:val="18"/>
+        </w:rPr>
+        <w:t>evidencias/</w:t>
+      </w:r>
+      <w:r>
+        <w:rPr>
+          <w:b w:val="0"/>
+          <w:i w:val="0"/>
+        </w:rPr>
+        <w:t>.</w:t>
       </w:r>
     </w:p>
     <w:p>
@@ -214,25 +351,18 @@
         <w:tblStyle w:val="TableGrid"/>
         <w:tblW w:type="auto" w:w="0"/>
         <w:jc w:val="center"/>
-        <w:tblLayout w:type="autofit"/>
         <w:tblLook w:firstColumn="1" w:firstRow="1" w:lastColumn="0" w:lastRow="0" w:noHBand="0" w:noVBand="1" w:val="04A0"/>
       </w:tblPr>
       <w:tblGrid>
-        <w:gridCol w:w="3331"/>
-        <w:gridCol w:w="3331"/>
-        <w:gridCol w:w="3331"/>
+        <w:gridCol w:w="3312"/>
+        <w:gridCol w:w="3312"/>
+        <w:gridCol w:w="3312"/>
       </w:tblGrid>
       <w:tr>
         <w:tc>
           <w:tcPr>
-            <w:tcW w:type="dxa" w:w="3331"/>
+            <w:tcW w:type="dxa" w:w="3312"/>
             <w:vAlign w:val="center"/>
-            <w:tcMar>
-              <w:top w:w="90" w:type="dxa"/>
-              <w:start w:w="100" w:type="dxa"/>
-              <w:bottom w:w="90" w:type="dxa"/>
-              <w:end w:w="100" w:type="dxa"/>
-            </w:tcMar>
             <w:shd w:fill="17365D"/>
           </w:tcPr>
           <w:p>
@@ -259,14 +389,8 @@
         </w:tc>
         <w:tc>
           <w:tcPr>
-            <w:tcW w:type="dxa" w:w="3331"/>
+            <w:tcW w:type="dxa" w:w="3312"/>
             <w:vAlign w:val="center"/>
-            <w:tcMar>
-              <w:top w:w="90" w:type="dxa"/>
-              <w:start w:w="100" w:type="dxa"/>
-              <w:bottom w:w="90" w:type="dxa"/>
-              <w:end w:w="100" w:type="dxa"/>
-            </w:tcMar>
             <w:shd w:fill="17365D"/>
           </w:tcPr>
           <w:p>
@@ -293,14 +417,8 @@
         </w:tc>
         <w:tc>
           <w:tcPr>
-            <w:tcW w:type="dxa" w:w="3331"/>
+            <w:tcW w:type="dxa" w:w="3312"/>
             <w:vAlign w:val="center"/>
-            <w:tcMar>
-              <w:top w:w="90" w:type="dxa"/>
-              <w:start w:w="100" w:type="dxa"/>
-              <w:bottom w:w="90" w:type="dxa"/>
-              <w:end w:w="100" w:type="dxa"/>
-            </w:tcMar>
             <w:shd w:fill="17365D"/>
           </w:tcPr>
           <w:p>
@@ -329,14 +447,8 @@
       <w:tr>
         <w:tc>
           <w:tcPr>
-            <w:tcW w:type="dxa" w:w="3331"/>
+            <w:tcW w:type="dxa" w:w="3312"/>
             <w:vAlign w:val="center"/>
-            <w:tcMar>
-              <w:top w:w="90" w:type="dxa"/>
-              <w:start w:w="100" w:type="dxa"/>
-              <w:bottom w:w="90" w:type="dxa"/>
-              <w:end w:w="100" w:type="dxa"/>
-            </w:tcMar>
           </w:tcPr>
           <w:p>
             <w:pPr>
@@ -359,14 +471,8 @@
         </w:tc>
         <w:tc>
           <w:tcPr>
-            <w:tcW w:type="dxa" w:w="3331"/>
+            <w:tcW w:type="dxa" w:w="3312"/>
             <w:vAlign w:val="center"/>
-            <w:tcMar>
-              <w:top w:w="90" w:type="dxa"/>
-              <w:start w:w="100" w:type="dxa"/>
-              <w:bottom w:w="90" w:type="dxa"/>
-              <w:end w:w="100" w:type="dxa"/>
-            </w:tcMar>
           </w:tcPr>
           <w:p>
             <w:pPr>
@@ -391,14 +497,8 @@
         </w:tc>
         <w:tc>
           <w:tcPr>
-            <w:tcW w:type="dxa" w:w="3331"/>
+            <w:tcW w:type="dxa" w:w="3312"/>
             <w:vAlign w:val="center"/>
-            <w:tcMar>
-              <w:top w:w="90" w:type="dxa"/>
-              <w:start w:w="100" w:type="dxa"/>
-              <w:bottom w:w="90" w:type="dxa"/>
-              <w:end w:w="100" w:type="dxa"/>
-            </w:tcMar>
           </w:tcPr>
           <w:p>
             <w:pPr>
@@ -423,14 +523,8 @@
       <w:tr>
         <w:tc>
           <w:tcPr>
-            <w:tcW w:type="dxa" w:w="3331"/>
+            <w:tcW w:type="dxa" w:w="3312"/>
             <w:vAlign w:val="center"/>
-            <w:tcMar>
-              <w:top w:w="90" w:type="dxa"/>
-              <w:start w:w="100" w:type="dxa"/>
-              <w:bottom w:w="90" w:type="dxa"/>
-              <w:end w:w="100" w:type="dxa"/>
-            </w:tcMar>
             <w:shd w:fill="F5F8FA"/>
           </w:tcPr>
           <w:p>
@@ -454,14 +548,8 @@
         </w:tc>
         <w:tc>
           <w:tcPr>
-            <w:tcW w:type="dxa" w:w="3331"/>
+            <w:tcW w:type="dxa" w:w="3312"/>
             <w:vAlign w:val="center"/>
-            <w:tcMar>
-              <w:top w:w="90" w:type="dxa"/>
-              <w:start w:w="100" w:type="dxa"/>
-              <w:bottom w:w="90" w:type="dxa"/>
-              <w:end w:w="100" w:type="dxa"/>
-            </w:tcMar>
             <w:shd w:fill="F5F8FA"/>
           </w:tcPr>
           <w:p>
@@ -487,14 +575,8 @@
         </w:tc>
         <w:tc>
           <w:tcPr>
-            <w:tcW w:type="dxa" w:w="3331"/>
+            <w:tcW w:type="dxa" w:w="3312"/>
             <w:vAlign w:val="center"/>
-            <w:tcMar>
-              <w:top w:w="90" w:type="dxa"/>
-              <w:start w:w="100" w:type="dxa"/>
-              <w:bottom w:w="90" w:type="dxa"/>
-              <w:end w:w="100" w:type="dxa"/>
-            </w:tcMar>
             <w:shd w:fill="F5F8FA"/>
           </w:tcPr>
           <w:p>
@@ -520,14 +602,8 @@
       <w:tr>
         <w:tc>
           <w:tcPr>
-            <w:tcW w:type="dxa" w:w="3331"/>
+            <w:tcW w:type="dxa" w:w="3312"/>
             <w:vAlign w:val="center"/>
-            <w:tcMar>
-              <w:top w:w="90" w:type="dxa"/>
-              <w:start w:w="100" w:type="dxa"/>
-              <w:bottom w:w="90" w:type="dxa"/>
-              <w:end w:w="100" w:type="dxa"/>
-            </w:tcMar>
           </w:tcPr>
           <w:p>
             <w:pPr>
@@ -550,14 +626,8 @@
         </w:tc>
         <w:tc>
           <w:tcPr>
-            <w:tcW w:type="dxa" w:w="3331"/>
+            <w:tcW w:type="dxa" w:w="3312"/>
             <w:vAlign w:val="center"/>
-            <w:tcMar>
-              <w:top w:w="90" w:type="dxa"/>
-              <w:start w:w="100" w:type="dxa"/>
-              <w:bottom w:w="90" w:type="dxa"/>
-              <w:end w:w="100" w:type="dxa"/>
-            </w:tcMar>
           </w:tcPr>
           <w:p>
             <w:pPr>
@@ -582,14 +652,8 @@
         </w:tc>
         <w:tc>
           <w:tcPr>
-            <w:tcW w:type="dxa" w:w="3331"/>
+            <w:tcW w:type="dxa" w:w="3312"/>
             <w:vAlign w:val="center"/>
-            <w:tcMar>
-              <w:top w:w="90" w:type="dxa"/>
-              <w:start w:w="100" w:type="dxa"/>
-              <w:bottom w:w="90" w:type="dxa"/>
-              <w:end w:w="100" w:type="dxa"/>
-            </w:tcMar>
           </w:tcPr>
           <w:p>
             <w:pPr>
@@ -614,14 +678,8 @@
       <w:tr>
         <w:tc>
           <w:tcPr>
-            <w:tcW w:type="dxa" w:w="3331"/>
+            <w:tcW w:type="dxa" w:w="3312"/>
             <w:vAlign w:val="center"/>
-            <w:tcMar>
-              <w:top w:w="90" w:type="dxa"/>
-              <w:start w:w="100" w:type="dxa"/>
-              <w:bottom w:w="90" w:type="dxa"/>
-              <w:end w:w="100" w:type="dxa"/>
-            </w:tcMar>
             <w:shd w:fill="F5F8FA"/>
           </w:tcPr>
           <w:p>
@@ -645,14 +703,8 @@
         </w:tc>
         <w:tc>
           <w:tcPr>
-            <w:tcW w:type="dxa" w:w="3331"/>
+            <w:tcW w:type="dxa" w:w="3312"/>
             <w:vAlign w:val="center"/>
-            <w:tcMar>
-              <w:top w:w="90" w:type="dxa"/>
-              <w:start w:w="100" w:type="dxa"/>
-              <w:bottom w:w="90" w:type="dxa"/>
-              <w:end w:w="100" w:type="dxa"/>
-            </w:tcMar>
             <w:shd w:fill="F5F8FA"/>
           </w:tcPr>
           <w:p>
@@ -678,14 +730,8 @@
         </w:tc>
         <w:tc>
           <w:tcPr>
-            <w:tcW w:type="dxa" w:w="3331"/>
+            <w:tcW w:type="dxa" w:w="3312"/>
             <w:vAlign w:val="center"/>
-            <w:tcMar>
-              <w:top w:w="90" w:type="dxa"/>
-              <w:start w:w="100" w:type="dxa"/>
-              <w:bottom w:w="90" w:type="dxa"/>
-              <w:end w:w="100" w:type="dxa"/>
-            </w:tcMar>
             <w:shd w:fill="F5F8FA"/>
           </w:tcPr>
           <w:p>
@@ -711,14 +757,8 @@
       <w:tr>
         <w:tc>
           <w:tcPr>
-            <w:tcW w:type="dxa" w:w="3331"/>
+            <w:tcW w:type="dxa" w:w="3312"/>
             <w:vAlign w:val="center"/>
-            <w:tcMar>
-              <w:top w:w="90" w:type="dxa"/>
-              <w:start w:w="100" w:type="dxa"/>
-              <w:bottom w:w="90" w:type="dxa"/>
-              <w:end w:w="100" w:type="dxa"/>
-            </w:tcMar>
           </w:tcPr>
           <w:p>
             <w:pPr>
@@ -741,14 +781,8 @@
         </w:tc>
         <w:tc>
           <w:tcPr>
-            <w:tcW w:type="dxa" w:w="3331"/>
+            <w:tcW w:type="dxa" w:w="3312"/>
             <w:vAlign w:val="center"/>
-            <w:tcMar>
-              <w:top w:w="90" w:type="dxa"/>
-              <w:start w:w="100" w:type="dxa"/>
-              <w:bottom w:w="90" w:type="dxa"/>
-              <w:end w:w="100" w:type="dxa"/>
-            </w:tcMar>
           </w:tcPr>
           <w:p>
             <w:pPr>
@@ -773,14 +807,8 @@
         </w:tc>
         <w:tc>
           <w:tcPr>
-            <w:tcW w:type="dxa" w:w="3331"/>
+            <w:tcW w:type="dxa" w:w="3312"/>
             <w:vAlign w:val="center"/>
-            <w:tcMar>
-              <w:top w:w="90" w:type="dxa"/>
-              <w:start w:w="100" w:type="dxa"/>
-              <w:bottom w:w="90" w:type="dxa"/>
-              <w:end w:w="100" w:type="dxa"/>
-            </w:tcMar>
           </w:tcPr>
           <w:p>
             <w:pPr>
@@ -805,14 +833,8 @@
       <w:tr>
         <w:tc>
           <w:tcPr>
-            <w:tcW w:type="dxa" w:w="3331"/>
+            <w:tcW w:type="dxa" w:w="3312"/>
             <w:vAlign w:val="center"/>
-            <w:tcMar>
-              <w:top w:w="90" w:type="dxa"/>
-              <w:start w:w="100" w:type="dxa"/>
-              <w:bottom w:w="90" w:type="dxa"/>
-              <w:end w:w="100" w:type="dxa"/>
-            </w:tcMar>
             <w:shd w:fill="F5F8FA"/>
           </w:tcPr>
           <w:p>
@@ -836,14 +858,8 @@
         </w:tc>
         <w:tc>
           <w:tcPr>
-            <w:tcW w:type="dxa" w:w="3331"/>
+            <w:tcW w:type="dxa" w:w="3312"/>
             <w:vAlign w:val="center"/>
-            <w:tcMar>
-              <w:top w:w="90" w:type="dxa"/>
-              <w:start w:w="100" w:type="dxa"/>
-              <w:bottom w:w="90" w:type="dxa"/>
-              <w:end w:w="100" w:type="dxa"/>
-            </w:tcMar>
             <w:shd w:fill="F5F8FA"/>
           </w:tcPr>
           <w:p>
@@ -869,14 +885,8 @@
         </w:tc>
         <w:tc>
           <w:tcPr>
-            <w:tcW w:type="dxa" w:w="3331"/>
+            <w:tcW w:type="dxa" w:w="3312"/>
             <w:vAlign w:val="center"/>
-            <w:tcMar>
-              <w:top w:w="90" w:type="dxa"/>
-              <w:start w:w="100" w:type="dxa"/>
-              <w:bottom w:w="90" w:type="dxa"/>
-              <w:end w:w="100" w:type="dxa"/>
-            </w:tcMar>
             <w:shd w:fill="F5F8FA"/>
           </w:tcPr>
           <w:p>
@@ -974,26 +984,19 @@
         <w:tblStyle w:val="TableGrid"/>
         <w:tblW w:type="auto" w:w="0"/>
         <w:jc w:val="center"/>
-        <w:tblLayout w:type="autofit"/>
         <w:tblLook w:firstColumn="1" w:firstRow="1" w:lastColumn="0" w:lastRow="0" w:noHBand="0" w:noVBand="1" w:val="04A0"/>
       </w:tblPr>
       <w:tblGrid>
-        <w:gridCol w:w="2498"/>
-        <w:gridCol w:w="2498"/>
-        <w:gridCol w:w="2498"/>
-        <w:gridCol w:w="2498"/>
+        <w:gridCol w:w="2484"/>
+        <w:gridCol w:w="2484"/>
+        <w:gridCol w:w="2484"/>
+        <w:gridCol w:w="2484"/>
       </w:tblGrid>
       <w:tr>
         <w:tc>
           <w:tcPr>
-            <w:tcW w:type="dxa" w:w="2498"/>
+            <w:tcW w:type="dxa" w:w="2484"/>
             <w:vAlign w:val="center"/>
-            <w:tcMar>
-              <w:top w:w="90" w:type="dxa"/>
-              <w:start w:w="100" w:type="dxa"/>
-              <w:bottom w:w="90" w:type="dxa"/>
-              <w:end w:w="100" w:type="dxa"/>
-            </w:tcMar>
             <w:shd w:fill="17365D"/>
           </w:tcPr>
           <w:p>
@@ -1020,14 +1023,8 @@
         </w:tc>
         <w:tc>
           <w:tcPr>
-            <w:tcW w:type="dxa" w:w="2498"/>
+            <w:tcW w:type="dxa" w:w="2484"/>
             <w:vAlign w:val="center"/>
-            <w:tcMar>
-              <w:top w:w="90" w:type="dxa"/>
-              <w:start w:w="100" w:type="dxa"/>
-              <w:bottom w:w="90" w:type="dxa"/>
-              <w:end w:w="100" w:type="dxa"/>
-            </w:tcMar>
             <w:shd w:fill="17365D"/>
           </w:tcPr>
           <w:p>
@@ -1054,14 +1051,8 @@
         </w:tc>
         <w:tc>
           <w:tcPr>
-            <w:tcW w:type="dxa" w:w="2498"/>
+            <w:tcW w:type="dxa" w:w="2484"/>
             <w:vAlign w:val="center"/>
-            <w:tcMar>
-              <w:top w:w="90" w:type="dxa"/>
-              <w:start w:w="100" w:type="dxa"/>
-              <w:bottom w:w="90" w:type="dxa"/>
-              <w:end w:w="100" w:type="dxa"/>
-            </w:tcMar>
             <w:shd w:fill="17365D"/>
           </w:tcPr>
           <w:p>
@@ -1088,14 +1079,8 @@
         </w:tc>
         <w:tc>
           <w:tcPr>
-            <w:tcW w:type="dxa" w:w="2498"/>
+            <w:tcW w:type="dxa" w:w="2484"/>
             <w:vAlign w:val="center"/>
-            <w:tcMar>
-              <w:top w:w="90" w:type="dxa"/>
-              <w:start w:w="100" w:type="dxa"/>
-              <w:bottom w:w="90" w:type="dxa"/>
-              <w:end w:w="100" w:type="dxa"/>
-            </w:tcMar>
             <w:shd w:fill="17365D"/>
           </w:tcPr>
           <w:p>
@@ -1124,14 +1109,8 @@
       <w:tr>
         <w:tc>
           <w:tcPr>
-            <w:tcW w:type="dxa" w:w="2498"/>
+            <w:tcW w:type="dxa" w:w="2484"/>
             <w:vAlign w:val="center"/>
-            <w:tcMar>
-              <w:top w:w="90" w:type="dxa"/>
-              <w:start w:w="100" w:type="dxa"/>
-              <w:bottom w:w="90" w:type="dxa"/>
-              <w:end w:w="100" w:type="dxa"/>
-            </w:tcMar>
           </w:tcPr>
           <w:p>
             <w:pPr>
@@ -1154,14 +1133,8 @@
         </w:tc>
         <w:tc>
           <w:tcPr>
-            <w:tcW w:type="dxa" w:w="2498"/>
+            <w:tcW w:type="dxa" w:w="2484"/>
             <w:vAlign w:val="center"/>
-            <w:tcMar>
-              <w:top w:w="90" w:type="dxa"/>
-              <w:start w:w="100" w:type="dxa"/>
-              <w:bottom w:w="90" w:type="dxa"/>
-              <w:end w:w="100" w:type="dxa"/>
-            </w:tcMar>
           </w:tcPr>
           <w:p>
             <w:pPr>
@@ -1186,14 +1159,8 @@
         </w:tc>
         <w:tc>
           <w:tcPr>
-            <w:tcW w:type="dxa" w:w="2498"/>
+            <w:tcW w:type="dxa" w:w="2484"/>
             <w:vAlign w:val="center"/>
-            <w:tcMar>
-              <w:top w:w="90" w:type="dxa"/>
-              <w:start w:w="100" w:type="dxa"/>
-              <w:bottom w:w="90" w:type="dxa"/>
-              <w:end w:w="100" w:type="dxa"/>
-            </w:tcMar>
           </w:tcPr>
           <w:p>
             <w:pPr>
@@ -1216,14 +1183,8 @@
         </w:tc>
         <w:tc>
           <w:tcPr>
-            <w:tcW w:type="dxa" w:w="2498"/>
+            <w:tcW w:type="dxa" w:w="2484"/>
             <w:vAlign w:val="center"/>
-            <w:tcMar>
-              <w:top w:w="90" w:type="dxa"/>
-              <w:start w:w="100" w:type="dxa"/>
-              <w:bottom w:w="90" w:type="dxa"/>
-              <w:end w:w="100" w:type="dxa"/>
-            </w:tcMar>
           </w:tcPr>
           <w:p>
             <w:pPr>
@@ -1248,14 +1209,8 @@
       <w:tr>
         <w:tc>
           <w:tcPr>
-            <w:tcW w:type="dxa" w:w="2498"/>
+            <w:tcW w:type="dxa" w:w="2484"/>
             <w:vAlign w:val="center"/>
-            <w:tcMar>
-              <w:top w:w="90" w:type="dxa"/>
-              <w:start w:w="100" w:type="dxa"/>
-              <w:bottom w:w="90" w:type="dxa"/>
-              <w:end w:w="100" w:type="dxa"/>
-            </w:tcMar>
             <w:shd w:fill="F5F8FA"/>
           </w:tcPr>
           <w:p>
@@ -1279,14 +1234,8 @@
         </w:tc>
         <w:tc>
           <w:tcPr>
-            <w:tcW w:type="dxa" w:w="2498"/>
+            <w:tcW w:type="dxa" w:w="2484"/>
             <w:vAlign w:val="center"/>
-            <w:tcMar>
-              <w:top w:w="90" w:type="dxa"/>
-              <w:start w:w="100" w:type="dxa"/>
-              <w:bottom w:w="90" w:type="dxa"/>
-              <w:end w:w="100" w:type="dxa"/>
-            </w:tcMar>
             <w:shd w:fill="F5F8FA"/>
           </w:tcPr>
           <w:p>
@@ -1312,14 +1261,8 @@
         </w:tc>
         <w:tc>
           <w:tcPr>
-            <w:tcW w:type="dxa" w:w="2498"/>
+            <w:tcW w:type="dxa" w:w="2484"/>
             <w:vAlign w:val="center"/>
-            <w:tcMar>
-              <w:top w:w="90" w:type="dxa"/>
-              <w:start w:w="100" w:type="dxa"/>
-              <w:bottom w:w="90" w:type="dxa"/>
-              <w:end w:w="100" w:type="dxa"/>
-            </w:tcMar>
             <w:shd w:fill="F5F8FA"/>
           </w:tcPr>
           <w:p>
@@ -1343,14 +1286,8 @@
         </w:tc>
         <w:tc>
           <w:tcPr>
-            <w:tcW w:type="dxa" w:w="2498"/>
+            <w:tcW w:type="dxa" w:w="2484"/>
             <w:vAlign w:val="center"/>
-            <w:tcMar>
-              <w:top w:w="90" w:type="dxa"/>
-              <w:start w:w="100" w:type="dxa"/>
-              <w:bottom w:w="90" w:type="dxa"/>
-              <w:end w:w="100" w:type="dxa"/>
-            </w:tcMar>
             <w:shd w:fill="F5F8FA"/>
           </w:tcPr>
           <w:p>
@@ -1376,14 +1313,8 @@
       <w:tr>
         <w:tc>
           <w:tcPr>
-            <w:tcW w:type="dxa" w:w="2498"/>
+            <w:tcW w:type="dxa" w:w="2484"/>
             <w:vAlign w:val="center"/>
-            <w:tcMar>
-              <w:top w:w="90" w:type="dxa"/>
-              <w:start w:w="100" w:type="dxa"/>
-              <w:bottom w:w="90" w:type="dxa"/>
-              <w:end w:w="100" w:type="dxa"/>
-            </w:tcMar>
           </w:tcPr>
           <w:p>
             <w:pPr>
@@ -1406,14 +1337,8 @@
         </w:tc>
         <w:tc>
           <w:tcPr>
-            <w:tcW w:type="dxa" w:w="2498"/>
+            <w:tcW w:type="dxa" w:w="2484"/>
             <w:vAlign w:val="center"/>
-            <w:tcMar>
-              <w:top w:w="90" w:type="dxa"/>
-              <w:start w:w="100" w:type="dxa"/>
-              <w:bottom w:w="90" w:type="dxa"/>
-              <w:end w:w="100" w:type="dxa"/>
-            </w:tcMar>
           </w:tcPr>
           <w:p>
             <w:pPr>
@@ -1438,14 +1363,8 @@
         </w:tc>
         <w:tc>
           <w:tcPr>
-            <w:tcW w:type="dxa" w:w="2498"/>
+            <w:tcW w:type="dxa" w:w="2484"/>
             <w:vAlign w:val="center"/>
-            <w:tcMar>
-              <w:top w:w="90" w:type="dxa"/>
-              <w:start w:w="100" w:type="dxa"/>
-              <w:bottom w:w="90" w:type="dxa"/>
-              <w:end w:w="100" w:type="dxa"/>
-            </w:tcMar>
           </w:tcPr>
           <w:p>
             <w:pPr>
@@ -1468,14 +1387,8 @@
         </w:tc>
         <w:tc>
           <w:tcPr>
-            <w:tcW w:type="dxa" w:w="2498"/>
+            <w:tcW w:type="dxa" w:w="2484"/>
             <w:vAlign w:val="center"/>
-            <w:tcMar>
-              <w:top w:w="90" w:type="dxa"/>
-              <w:start w:w="100" w:type="dxa"/>
-              <w:bottom w:w="90" w:type="dxa"/>
-              <w:end w:w="100" w:type="dxa"/>
-            </w:tcMar>
           </w:tcPr>
           <w:p>
             <w:pPr>
@@ -1500,14 +1413,8 @@
       <w:tr>
         <w:tc>
           <w:tcPr>
-            <w:tcW w:type="dxa" w:w="2498"/>
+            <w:tcW w:type="dxa" w:w="2484"/>
             <w:vAlign w:val="center"/>
-            <w:tcMar>
-              <w:top w:w="90" w:type="dxa"/>
-              <w:start w:w="100" w:type="dxa"/>
-              <w:bottom w:w="90" w:type="dxa"/>
-              <w:end w:w="100" w:type="dxa"/>
-            </w:tcMar>
             <w:shd w:fill="F5F8FA"/>
           </w:tcPr>
           <w:p>
@@ -1531,14 +1438,8 @@
         </w:tc>
         <w:tc>
           <w:tcPr>
-            <w:tcW w:type="dxa" w:w="2498"/>
+            <w:tcW w:type="dxa" w:w="2484"/>
             <w:vAlign w:val="center"/>
-            <w:tcMar>
-              <w:top w:w="90" w:type="dxa"/>
-              <w:start w:w="100" w:type="dxa"/>
-              <w:bottom w:w="90" w:type="dxa"/>
-              <w:end w:w="100" w:type="dxa"/>
-            </w:tcMar>
             <w:shd w:fill="F5F8FA"/>
           </w:tcPr>
           <w:p>
@@ -1564,14 +1465,8 @@
         </w:tc>
         <w:tc>
           <w:tcPr>
-            <w:tcW w:type="dxa" w:w="2498"/>
+            <w:tcW w:type="dxa" w:w="2484"/>
             <w:vAlign w:val="center"/>
-            <w:tcMar>
-              <w:top w:w="90" w:type="dxa"/>
-              <w:start w:w="100" w:type="dxa"/>
-              <w:bottom w:w="90" w:type="dxa"/>
-              <w:end w:w="100" w:type="dxa"/>
-            </w:tcMar>
             <w:shd w:fill="F5F8FA"/>
           </w:tcPr>
           <w:p>
@@ -1595,14 +1490,8 @@
         </w:tc>
         <w:tc>
           <w:tcPr>
-            <w:tcW w:type="dxa" w:w="2498"/>
+            <w:tcW w:type="dxa" w:w="2484"/>
             <w:vAlign w:val="center"/>
-            <w:tcMar>
-              <w:top w:w="90" w:type="dxa"/>
-              <w:start w:w="100" w:type="dxa"/>
-              <w:bottom w:w="90" w:type="dxa"/>
-              <w:end w:w="100" w:type="dxa"/>
-            </w:tcMar>
             <w:shd w:fill="F5F8FA"/>
           </w:tcPr>
           <w:p>
@@ -1628,14 +1517,8 @@
       <w:tr>
         <w:tc>
           <w:tcPr>
-            <w:tcW w:type="dxa" w:w="2498"/>
+            <w:tcW w:type="dxa" w:w="2484"/>
             <w:vAlign w:val="center"/>
-            <w:tcMar>
-              <w:top w:w="90" w:type="dxa"/>
-              <w:start w:w="100" w:type="dxa"/>
-              <w:bottom w:w="90" w:type="dxa"/>
-              <w:end w:w="100" w:type="dxa"/>
-            </w:tcMar>
           </w:tcPr>
           <w:p>
             <w:pPr>
@@ -1658,14 +1541,8 @@
         </w:tc>
         <w:tc>
           <w:tcPr>
-            <w:tcW w:type="dxa" w:w="2498"/>
+            <w:tcW w:type="dxa" w:w="2484"/>
             <w:vAlign w:val="center"/>
-            <w:tcMar>
-              <w:top w:w="90" w:type="dxa"/>
-              <w:start w:w="100" w:type="dxa"/>
-              <w:bottom w:w="90" w:type="dxa"/>
-              <w:end w:w="100" w:type="dxa"/>
-            </w:tcMar>
           </w:tcPr>
           <w:p>
             <w:pPr>
@@ -1690,14 +1567,8 @@
         </w:tc>
         <w:tc>
           <w:tcPr>
-            <w:tcW w:type="dxa" w:w="2498"/>
+            <w:tcW w:type="dxa" w:w="2484"/>
             <w:vAlign w:val="center"/>
-            <w:tcMar>
-              <w:top w:w="90" w:type="dxa"/>
-              <w:start w:w="100" w:type="dxa"/>
-              <w:bottom w:w="90" w:type="dxa"/>
-              <w:end w:w="100" w:type="dxa"/>
-            </w:tcMar>
           </w:tcPr>
           <w:p>
             <w:pPr>
@@ -1720,14 +1591,8 @@
         </w:tc>
         <w:tc>
           <w:tcPr>
-            <w:tcW w:type="dxa" w:w="2498"/>
+            <w:tcW w:type="dxa" w:w="2484"/>
             <w:vAlign w:val="center"/>
-            <w:tcMar>
-              <w:top w:w="90" w:type="dxa"/>
-              <w:start w:w="100" w:type="dxa"/>
-              <w:bottom w:w="90" w:type="dxa"/>
-              <w:end w:w="100" w:type="dxa"/>
-            </w:tcMar>
           </w:tcPr>
           <w:p>
             <w:pPr>
@@ -1752,14 +1617,8 @@
       <w:tr>
         <w:tc>
           <w:tcPr>
-            <w:tcW w:type="dxa" w:w="2498"/>
+            <w:tcW w:type="dxa" w:w="2484"/>
             <w:vAlign w:val="center"/>
-            <w:tcMar>
-              <w:top w:w="90" w:type="dxa"/>
-              <w:start w:w="100" w:type="dxa"/>
-              <w:bottom w:w="90" w:type="dxa"/>
-              <w:end w:w="100" w:type="dxa"/>
-            </w:tcMar>
             <w:shd w:fill="F5F8FA"/>
           </w:tcPr>
           <w:p>
@@ -1783,14 +1642,8 @@
         </w:tc>
         <w:tc>
           <w:tcPr>
-            <w:tcW w:type="dxa" w:w="2498"/>
+            <w:tcW w:type="dxa" w:w="2484"/>
             <w:vAlign w:val="center"/>
-            <w:tcMar>
-              <w:top w:w="90" w:type="dxa"/>
-              <w:start w:w="100" w:type="dxa"/>
-              <w:bottom w:w="90" w:type="dxa"/>
-              <w:end w:w="100" w:type="dxa"/>
-            </w:tcMar>
             <w:shd w:fill="F5F8FA"/>
           </w:tcPr>
           <w:p>
@@ -1816,14 +1669,8 @@
         </w:tc>
         <w:tc>
           <w:tcPr>
-            <w:tcW w:type="dxa" w:w="2498"/>
+            <w:tcW w:type="dxa" w:w="2484"/>
             <w:vAlign w:val="center"/>
-            <w:tcMar>
-              <w:top w:w="90" w:type="dxa"/>
-              <w:start w:w="100" w:type="dxa"/>
-              <w:bottom w:w="90" w:type="dxa"/>
-              <w:end w:w="100" w:type="dxa"/>
-            </w:tcMar>
             <w:shd w:fill="F5F8FA"/>
           </w:tcPr>
           <w:p>
@@ -1847,14 +1694,8 @@
         </w:tc>
         <w:tc>
           <w:tcPr>
-            <w:tcW w:type="dxa" w:w="2498"/>
+            <w:tcW w:type="dxa" w:w="2484"/>
             <w:vAlign w:val="center"/>
-            <w:tcMar>
-              <w:top w:w="90" w:type="dxa"/>
-              <w:start w:w="100" w:type="dxa"/>
-              <w:bottom w:w="90" w:type="dxa"/>
-              <w:end w:w="100" w:type="dxa"/>
-            </w:tcMar>
             <w:shd w:fill="F5F8FA"/>
           </w:tcPr>
           <w:p>
@@ -1880,14 +1721,8 @@
       <w:tr>
         <w:tc>
           <w:tcPr>
-            <w:tcW w:type="dxa" w:w="2498"/>
+            <w:tcW w:type="dxa" w:w="2484"/>
             <w:vAlign w:val="center"/>
-            <w:tcMar>
-              <w:top w:w="90" w:type="dxa"/>
-              <w:start w:w="100" w:type="dxa"/>
-              <w:bottom w:w="90" w:type="dxa"/>
-              <w:end w:w="100" w:type="dxa"/>
-            </w:tcMar>
           </w:tcPr>
           <w:p>
             <w:pPr>
@@ -1910,14 +1745,8 @@
         </w:tc>
         <w:tc>
           <w:tcPr>
-            <w:tcW w:type="dxa" w:w="2498"/>
+            <w:tcW w:type="dxa" w:w="2484"/>
             <w:vAlign w:val="center"/>
-            <w:tcMar>
-              <w:top w:w="90" w:type="dxa"/>
-              <w:start w:w="100" w:type="dxa"/>
-              <w:bottom w:w="90" w:type="dxa"/>
-              <w:end w:w="100" w:type="dxa"/>
-            </w:tcMar>
           </w:tcPr>
           <w:p>
             <w:pPr>
@@ -1942,14 +1771,8 @@
         </w:tc>
         <w:tc>
           <w:tcPr>
-            <w:tcW w:type="dxa" w:w="2498"/>
+            <w:tcW w:type="dxa" w:w="2484"/>
             <w:vAlign w:val="center"/>
-            <w:tcMar>
-              <w:top w:w="90" w:type="dxa"/>
-              <w:start w:w="100" w:type="dxa"/>
-              <w:bottom w:w="90" w:type="dxa"/>
-              <w:end w:w="100" w:type="dxa"/>
-            </w:tcMar>
           </w:tcPr>
           <w:p>
             <w:pPr>
@@ -1972,14 +1795,8 @@
         </w:tc>
         <w:tc>
           <w:tcPr>
-            <w:tcW w:type="dxa" w:w="2498"/>
+            <w:tcW w:type="dxa" w:w="2484"/>
             <w:vAlign w:val="center"/>
-            <w:tcMar>
-              <w:top w:w="90" w:type="dxa"/>
-              <w:start w:w="100" w:type="dxa"/>
-              <w:bottom w:w="90" w:type="dxa"/>
-              <w:end w:w="100" w:type="dxa"/>
-            </w:tcMar>
           </w:tcPr>
           <w:p>
             <w:pPr>
@@ -2004,14 +1821,8 @@
       <w:tr>
         <w:tc>
           <w:tcPr>
-            <w:tcW w:type="dxa" w:w="2498"/>
+            <w:tcW w:type="dxa" w:w="2484"/>
             <w:vAlign w:val="center"/>
-            <w:tcMar>
-              <w:top w:w="90" w:type="dxa"/>
-              <w:start w:w="100" w:type="dxa"/>
-              <w:bottom w:w="90" w:type="dxa"/>
-              <w:end w:w="100" w:type="dxa"/>
-            </w:tcMar>
             <w:shd w:fill="F5F8FA"/>
           </w:tcPr>
           <w:p>
@@ -2035,14 +1846,8 @@
         </w:tc>
         <w:tc>
           <w:tcPr>
-            <w:tcW w:type="dxa" w:w="2498"/>
+            <w:tcW w:type="dxa" w:w="2484"/>
             <w:vAlign w:val="center"/>
-            <w:tcMar>
-              <w:top w:w="90" w:type="dxa"/>
-              <w:start w:w="100" w:type="dxa"/>
-              <w:bottom w:w="90" w:type="dxa"/>
-              <w:end w:w="100" w:type="dxa"/>
-            </w:tcMar>
             <w:shd w:fill="F5F8FA"/>
           </w:tcPr>
           <w:p>
@@ -2068,14 +1873,8 @@
         </w:tc>
         <w:tc>
           <w:tcPr>
-            <w:tcW w:type="dxa" w:w="2498"/>
+            <w:tcW w:type="dxa" w:w="2484"/>
             <w:vAlign w:val="center"/>
-            <w:tcMar>
-              <w:top w:w="90" w:type="dxa"/>
-              <w:start w:w="100" w:type="dxa"/>
-              <w:bottom w:w="90" w:type="dxa"/>
-              <w:end w:w="100" w:type="dxa"/>
-            </w:tcMar>
             <w:shd w:fill="F5F8FA"/>
           </w:tcPr>
           <w:p>
@@ -2099,14 +1898,8 @@
         </w:tc>
         <w:tc>
           <w:tcPr>
-            <w:tcW w:type="dxa" w:w="2498"/>
+            <w:tcW w:type="dxa" w:w="2484"/>
             <w:vAlign w:val="center"/>
-            <w:tcMar>
-              <w:top w:w="90" w:type="dxa"/>
-              <w:start w:w="100" w:type="dxa"/>
-              <w:bottom w:w="90" w:type="dxa"/>
-              <w:end w:w="100" w:type="dxa"/>
-            </w:tcMar>
             <w:shd w:fill="F5F8FA"/>
           </w:tcPr>
           <w:p>
@@ -2132,14 +1925,8 @@
       <w:tr>
         <w:tc>
           <w:tcPr>
-            <w:tcW w:type="dxa" w:w="2498"/>
+            <w:tcW w:type="dxa" w:w="2484"/>
             <w:vAlign w:val="center"/>
-            <w:tcMar>
-              <w:top w:w="90" w:type="dxa"/>
-              <w:start w:w="100" w:type="dxa"/>
-              <w:bottom w:w="90" w:type="dxa"/>
-              <w:end w:w="100" w:type="dxa"/>
-            </w:tcMar>
           </w:tcPr>
           <w:p>
             <w:pPr>
@@ -2162,14 +1949,8 @@
         </w:tc>
         <w:tc>
           <w:tcPr>
-            <w:tcW w:type="dxa" w:w="2498"/>
+            <w:tcW w:type="dxa" w:w="2484"/>
             <w:vAlign w:val="center"/>
-            <w:tcMar>
-              <w:top w:w="90" w:type="dxa"/>
-              <w:start w:w="100" w:type="dxa"/>
-              <w:bottom w:w="90" w:type="dxa"/>
-              <w:end w:w="100" w:type="dxa"/>
-            </w:tcMar>
           </w:tcPr>
           <w:p>
             <w:pPr>
@@ -2194,14 +1975,8 @@
         </w:tc>
         <w:tc>
           <w:tcPr>
-            <w:tcW w:type="dxa" w:w="2498"/>
+            <w:tcW w:type="dxa" w:w="2484"/>
             <w:vAlign w:val="center"/>
-            <w:tcMar>
-              <w:top w:w="90" w:type="dxa"/>
-              <w:start w:w="100" w:type="dxa"/>
-              <w:bottom w:w="90" w:type="dxa"/>
-              <w:end w:w="100" w:type="dxa"/>
-            </w:tcMar>
           </w:tcPr>
           <w:p>
             <w:pPr>
@@ -2224,14 +1999,8 @@
         </w:tc>
         <w:tc>
           <w:tcPr>
-            <w:tcW w:type="dxa" w:w="2498"/>
+            <w:tcW w:type="dxa" w:w="2484"/>
             <w:vAlign w:val="center"/>
-            <w:tcMar>
-              <w:top w:w="90" w:type="dxa"/>
-              <w:start w:w="100" w:type="dxa"/>
-              <w:bottom w:w="90" w:type="dxa"/>
-              <w:end w:w="100" w:type="dxa"/>
-            </w:tcMar>
           </w:tcPr>
           <w:p>
             <w:pPr>
@@ -2256,14 +2025,8 @@
       <w:tr>
         <w:tc>
           <w:tcPr>
-            <w:tcW w:type="dxa" w:w="2498"/>
+            <w:tcW w:type="dxa" w:w="2484"/>
             <w:vAlign w:val="center"/>
-            <w:tcMar>
-              <w:top w:w="90" w:type="dxa"/>
-              <w:start w:w="100" w:type="dxa"/>
-              <w:bottom w:w="90" w:type="dxa"/>
-              <w:end w:w="100" w:type="dxa"/>
-            </w:tcMar>
             <w:shd w:fill="F5F8FA"/>
           </w:tcPr>
           <w:p>
@@ -2287,14 +2050,8 @@
         </w:tc>
         <w:tc>
           <w:tcPr>
-            <w:tcW w:type="dxa" w:w="2498"/>
+            <w:tcW w:type="dxa" w:w="2484"/>
             <w:vAlign w:val="center"/>
-            <w:tcMar>
-              <w:top w:w="90" w:type="dxa"/>
-              <w:start w:w="100" w:type="dxa"/>
-              <w:bottom w:w="90" w:type="dxa"/>
-              <w:end w:w="100" w:type="dxa"/>
-            </w:tcMar>
             <w:shd w:fill="F5F8FA"/>
           </w:tcPr>
           <w:p>
@@ -2320,14 +2077,8 @@
         </w:tc>
         <w:tc>
           <w:tcPr>
-            <w:tcW w:type="dxa" w:w="2498"/>
+            <w:tcW w:type="dxa" w:w="2484"/>
             <w:vAlign w:val="center"/>
-            <w:tcMar>
-              <w:top w:w="90" w:type="dxa"/>
-              <w:start w:w="100" w:type="dxa"/>
-              <w:bottom w:w="90" w:type="dxa"/>
-              <w:end w:w="100" w:type="dxa"/>
-            </w:tcMar>
             <w:shd w:fill="F5F8FA"/>
           </w:tcPr>
           <w:p>
@@ -2351,14 +2102,8 @@
         </w:tc>
         <w:tc>
           <w:tcPr>
-            <w:tcW w:type="dxa" w:w="2498"/>
+            <w:tcW w:type="dxa" w:w="2484"/>
             <w:vAlign w:val="center"/>
-            <w:tcMar>
-              <w:top w:w="90" w:type="dxa"/>
-              <w:start w:w="100" w:type="dxa"/>
-              <w:bottom w:w="90" w:type="dxa"/>
-              <w:end w:w="100" w:type="dxa"/>
-            </w:tcMar>
             <w:shd w:fill="F5F8FA"/>
           </w:tcPr>
           <w:p>
@@ -2384,14 +2129,8 @@
       <w:tr>
         <w:tc>
           <w:tcPr>
-            <w:tcW w:type="dxa" w:w="2498"/>
+            <w:tcW w:type="dxa" w:w="2484"/>
             <w:vAlign w:val="center"/>
-            <w:tcMar>
-              <w:top w:w="90" w:type="dxa"/>
-              <w:start w:w="100" w:type="dxa"/>
-              <w:bottom w:w="90" w:type="dxa"/>
-              <w:end w:w="100" w:type="dxa"/>
-            </w:tcMar>
           </w:tcPr>
           <w:p>
             <w:pPr>
@@ -2414,14 +2153,8 @@
         </w:tc>
         <w:tc>
           <w:tcPr>
-            <w:tcW w:type="dxa" w:w="2498"/>
+            <w:tcW w:type="dxa" w:w="2484"/>
             <w:vAlign w:val="center"/>
-            <w:tcMar>
-              <w:top w:w="90" w:type="dxa"/>
-              <w:start w:w="100" w:type="dxa"/>
-              <w:bottom w:w="90" w:type="dxa"/>
-              <w:end w:w="100" w:type="dxa"/>
-            </w:tcMar>
           </w:tcPr>
           <w:p>
             <w:pPr>
@@ -2446,14 +2179,8 @@
         </w:tc>
         <w:tc>
           <w:tcPr>
-            <w:tcW w:type="dxa" w:w="2498"/>
+            <w:tcW w:type="dxa" w:w="2484"/>
             <w:vAlign w:val="center"/>
-            <w:tcMar>
-              <w:top w:w="90" w:type="dxa"/>
-              <w:start w:w="100" w:type="dxa"/>
-              <w:bottom w:w="90" w:type="dxa"/>
-              <w:end w:w="100" w:type="dxa"/>
-            </w:tcMar>
           </w:tcPr>
           <w:p>
             <w:pPr>
@@ -2476,14 +2203,8 @@
         </w:tc>
         <w:tc>
           <w:tcPr>
-            <w:tcW w:type="dxa" w:w="2498"/>
+            <w:tcW w:type="dxa" w:w="2484"/>
             <w:vAlign w:val="center"/>
-            <w:tcMar>
-              <w:top w:w="90" w:type="dxa"/>
-              <w:start w:w="100" w:type="dxa"/>
-              <w:bottom w:w="90" w:type="dxa"/>
-              <w:end w:w="100" w:type="dxa"/>
-            </w:tcMar>
           </w:tcPr>
           <w:p>
             <w:pPr>
@@ -3234,24 +2955,17 @@
         <w:tblStyle w:val="TableGrid"/>
         <w:tblW w:type="auto" w:w="0"/>
         <w:jc w:val="center"/>
-        <w:tblLayout w:type="autofit"/>
         <w:tblLook w:firstColumn="1" w:firstRow="1" w:lastColumn="0" w:lastRow="0" w:noHBand="0" w:noVBand="1" w:val="04A0"/>
       </w:tblPr>
       <w:tblGrid>
-        <w:gridCol w:w="4997"/>
-        <w:gridCol w:w="4997"/>
+        <w:gridCol w:w="4968"/>
+        <w:gridCol w:w="4968"/>
       </w:tblGrid>
       <w:tr>
         <w:tc>
           <w:tcPr>
-            <w:tcW w:type="dxa" w:w="4997"/>
+            <w:tcW w:type="dxa" w:w="4968"/>
             <w:vAlign w:val="center"/>
-            <w:tcMar>
-              <w:top w:w="90" w:type="dxa"/>
-              <w:start w:w="100" w:type="dxa"/>
-              <w:bottom w:w="90" w:type="dxa"/>
-              <w:end w:w="100" w:type="dxa"/>
-            </w:tcMar>
             <w:shd w:fill="17365D"/>
           </w:tcPr>
           <w:p>
@@ -3278,14 +2992,8 @@
         </w:tc>
         <w:tc>
           <w:tcPr>
-            <w:tcW w:type="dxa" w:w="4997"/>
+            <w:tcW w:type="dxa" w:w="4968"/>
             <w:vAlign w:val="center"/>
-            <w:tcMar>
-              <w:top w:w="90" w:type="dxa"/>
-              <w:start w:w="100" w:type="dxa"/>
-              <w:bottom w:w="90" w:type="dxa"/>
-              <w:end w:w="100" w:type="dxa"/>
-            </w:tcMar>
             <w:shd w:fill="17365D"/>
           </w:tcPr>
           <w:p>
@@ -3314,14 +3022,8 @@
       <w:tr>
         <w:tc>
           <w:tcPr>
-            <w:tcW w:type="dxa" w:w="4997"/>
+            <w:tcW w:type="dxa" w:w="4968"/>
             <w:vAlign w:val="center"/>
-            <w:tcMar>
-              <w:top w:w="90" w:type="dxa"/>
-              <w:start w:w="100" w:type="dxa"/>
-              <w:bottom w:w="90" w:type="dxa"/>
-              <w:end w:w="100" w:type="dxa"/>
-            </w:tcMar>
           </w:tcPr>
           <w:p>
             <w:pPr>
@@ -3346,14 +3048,8 @@
         </w:tc>
         <w:tc>
           <w:tcPr>
-            <w:tcW w:type="dxa" w:w="4997"/>
+            <w:tcW w:type="dxa" w:w="4968"/>
             <w:vAlign w:val="center"/>
-            <w:tcMar>
-              <w:top w:w="90" w:type="dxa"/>
-              <w:start w:w="100" w:type="dxa"/>
-              <w:bottom w:w="90" w:type="dxa"/>
-              <w:end w:w="100" w:type="dxa"/>
-            </w:tcMar>
           </w:tcPr>
           <w:p>
             <w:pPr>
@@ -3378,14 +3074,8 @@
       <w:tr>
         <w:tc>
           <w:tcPr>
-            <w:tcW w:type="dxa" w:w="4997"/>
+            <w:tcW w:type="dxa" w:w="4968"/>
             <w:vAlign w:val="center"/>
-            <w:tcMar>
-              <w:top w:w="90" w:type="dxa"/>
-              <w:start w:w="100" w:type="dxa"/>
-              <w:bottom w:w="90" w:type="dxa"/>
-              <w:end w:w="100" w:type="dxa"/>
-            </w:tcMar>
             <w:shd w:fill="F5F8FA"/>
           </w:tcPr>
           <w:p>
@@ -3411,14 +3101,8 @@
         </w:tc>
         <w:tc>
           <w:tcPr>
-            <w:tcW w:type="dxa" w:w="4997"/>
+            <w:tcW w:type="dxa" w:w="4968"/>
             <w:vAlign w:val="center"/>
-            <w:tcMar>
-              <w:top w:w="90" w:type="dxa"/>
-              <w:start w:w="100" w:type="dxa"/>
-              <w:bottom w:w="90" w:type="dxa"/>
-              <w:end w:w="100" w:type="dxa"/>
-            </w:tcMar>
             <w:shd w:fill="F5F8FA"/>
           </w:tcPr>
           <w:p>
@@ -3444,14 +3128,8 @@
       <w:tr>
         <w:tc>
           <w:tcPr>
-            <w:tcW w:type="dxa" w:w="4997"/>
+            <w:tcW w:type="dxa" w:w="4968"/>
             <w:vAlign w:val="center"/>
-            <w:tcMar>
-              <w:top w:w="90" w:type="dxa"/>
-              <w:start w:w="100" w:type="dxa"/>
-              <w:bottom w:w="90" w:type="dxa"/>
-              <w:end w:w="100" w:type="dxa"/>
-            </w:tcMar>
           </w:tcPr>
           <w:p>
             <w:pPr>
@@ -3476,14 +3154,8 @@
         </w:tc>
         <w:tc>
           <w:tcPr>
-            <w:tcW w:type="dxa" w:w="4997"/>
+            <w:tcW w:type="dxa" w:w="4968"/>
             <w:vAlign w:val="center"/>
-            <w:tcMar>
-              <w:top w:w="90" w:type="dxa"/>
-              <w:start w:w="100" w:type="dxa"/>
-              <w:bottom w:w="90" w:type="dxa"/>
-              <w:end w:w="100" w:type="dxa"/>
-            </w:tcMar>
           </w:tcPr>
           <w:p>
             <w:pPr>
@@ -3508,14 +3180,8 @@
       <w:tr>
         <w:tc>
           <w:tcPr>
-            <w:tcW w:type="dxa" w:w="4997"/>
+            <w:tcW w:type="dxa" w:w="4968"/>
             <w:vAlign w:val="center"/>
-            <w:tcMar>
-              <w:top w:w="90" w:type="dxa"/>
-              <w:start w:w="100" w:type="dxa"/>
-              <w:bottom w:w="90" w:type="dxa"/>
-              <w:end w:w="100" w:type="dxa"/>
-            </w:tcMar>
             <w:shd w:fill="F5F8FA"/>
           </w:tcPr>
           <w:p>
@@ -3541,14 +3207,8 @@
         </w:tc>
         <w:tc>
           <w:tcPr>
-            <w:tcW w:type="dxa" w:w="4997"/>
+            <w:tcW w:type="dxa" w:w="4968"/>
             <w:vAlign w:val="center"/>
-            <w:tcMar>
-              <w:top w:w="90" w:type="dxa"/>
-              <w:start w:w="100" w:type="dxa"/>
-              <w:bottom w:w="90" w:type="dxa"/>
-              <w:end w:w="100" w:type="dxa"/>
-            </w:tcMar>
             <w:shd w:fill="F5F8FA"/>
           </w:tcPr>
           <w:p>
@@ -3574,14 +3234,8 @@
       <w:tr>
         <w:tc>
           <w:tcPr>
-            <w:tcW w:type="dxa" w:w="4997"/>
+            <w:tcW w:type="dxa" w:w="4968"/>
             <w:vAlign w:val="center"/>
-            <w:tcMar>
-              <w:top w:w="90" w:type="dxa"/>
-              <w:start w:w="100" w:type="dxa"/>
-              <w:bottom w:w="90" w:type="dxa"/>
-              <w:end w:w="100" w:type="dxa"/>
-            </w:tcMar>
           </w:tcPr>
           <w:p>
             <w:pPr>
@@ -3606,14 +3260,8 @@
         </w:tc>
         <w:tc>
           <w:tcPr>
-            <w:tcW w:type="dxa" w:w="4997"/>
+            <w:tcW w:type="dxa" w:w="4968"/>
             <w:vAlign w:val="center"/>
-            <w:tcMar>
-              <w:top w:w="90" w:type="dxa"/>
-              <w:start w:w="100" w:type="dxa"/>
-              <w:bottom w:w="90" w:type="dxa"/>
-              <w:end w:w="100" w:type="dxa"/>
-            </w:tcMar>
           </w:tcPr>
           <w:p>
             <w:pPr>
@@ -3638,14 +3286,8 @@
       <w:tr>
         <w:tc>
           <w:tcPr>
-            <w:tcW w:type="dxa" w:w="4997"/>
+            <w:tcW w:type="dxa" w:w="4968"/>
             <w:vAlign w:val="center"/>
-            <w:tcMar>
-              <w:top w:w="90" w:type="dxa"/>
-              <w:start w:w="100" w:type="dxa"/>
-              <w:bottom w:w="90" w:type="dxa"/>
-              <w:end w:w="100" w:type="dxa"/>
-            </w:tcMar>
             <w:shd w:fill="F5F8FA"/>
           </w:tcPr>
           <w:p>
@@ -3671,14 +3313,8 @@
         </w:tc>
         <w:tc>
           <w:tcPr>
-            <w:tcW w:type="dxa" w:w="4997"/>
+            <w:tcW w:type="dxa" w:w="4968"/>
             <w:vAlign w:val="center"/>
-            <w:tcMar>
-              <w:top w:w="90" w:type="dxa"/>
-              <w:start w:w="100" w:type="dxa"/>
-              <w:bottom w:w="90" w:type="dxa"/>
-              <w:end w:w="100" w:type="dxa"/>
-            </w:tcMar>
             <w:shd w:fill="F5F8FA"/>
           </w:tcPr>
           <w:p>
@@ -3704,14 +3340,8 @@
       <w:tr>
         <w:tc>
           <w:tcPr>
-            <w:tcW w:type="dxa" w:w="4997"/>
+            <w:tcW w:type="dxa" w:w="4968"/>
             <w:vAlign w:val="center"/>
-            <w:tcMar>
-              <w:top w:w="90" w:type="dxa"/>
-              <w:start w:w="100" w:type="dxa"/>
-              <w:bottom w:w="90" w:type="dxa"/>
-              <w:end w:w="100" w:type="dxa"/>
-            </w:tcMar>
           </w:tcPr>
           <w:p>
             <w:pPr>
@@ -3736,14 +3366,8 @@
         </w:tc>
         <w:tc>
           <w:tcPr>
-            <w:tcW w:type="dxa" w:w="4997"/>
+            <w:tcW w:type="dxa" w:w="4968"/>
             <w:vAlign w:val="center"/>
-            <w:tcMar>
-              <w:top w:w="90" w:type="dxa"/>
-              <w:start w:w="100" w:type="dxa"/>
-              <w:bottom w:w="90" w:type="dxa"/>
-              <w:end w:w="100" w:type="dxa"/>
-            </w:tcMar>
           </w:tcPr>
           <w:p>
             <w:pPr>
@@ -3768,14 +3392,8 @@
       <w:tr>
         <w:tc>
           <w:tcPr>
-            <w:tcW w:type="dxa" w:w="4997"/>
+            <w:tcW w:type="dxa" w:w="4968"/>
             <w:vAlign w:val="center"/>
-            <w:tcMar>
-              <w:top w:w="90" w:type="dxa"/>
-              <w:start w:w="100" w:type="dxa"/>
-              <w:bottom w:w="90" w:type="dxa"/>
-              <w:end w:w="100" w:type="dxa"/>
-            </w:tcMar>
             <w:shd w:fill="F5F8FA"/>
           </w:tcPr>
           <w:p>
@@ -3801,14 +3419,8 @@
         </w:tc>
         <w:tc>
           <w:tcPr>
-            <w:tcW w:type="dxa" w:w="4997"/>
+            <w:tcW w:type="dxa" w:w="4968"/>
             <w:vAlign w:val="center"/>
-            <w:tcMar>
-              <w:top w:w="90" w:type="dxa"/>
-              <w:start w:w="100" w:type="dxa"/>
-              <w:bottom w:w="90" w:type="dxa"/>
-              <w:end w:w="100" w:type="dxa"/>
-            </w:tcMar>
             <w:shd w:fill="F5F8FA"/>
           </w:tcPr>
           <w:p>
@@ -3891,7 +3503,7 @@
       <w:r>
         <w:drawing>
           <wp:inline xmlns:a="http://schemas.openxmlformats.org/drawingml/2006/main" xmlns:pic="http://schemas.openxmlformats.org/drawingml/2006/picture">
-            <wp:extent cx="5715000" cy="4167188"/>
+            <wp:extent cx="5669280" cy="4133850"/>
             <wp:docPr id="1" name="Picture 1"/>
             <wp:cNvGraphicFramePr>
               <a:graphicFrameLocks noChangeAspect="1"/>
@@ -3912,7 +3524,7 @@
                   <pic:spPr>
                     <a:xfrm>
                       <a:off x="0" y="0"/>
-                      <a:ext cx="5715000" cy="4167188"/>
+                      <a:ext cx="5669280" cy="4133850"/>
                     </a:xfrm>
                     <a:prstGeom prst="rect"/>
                   </pic:spPr>
@@ -3945,7 +3557,7 @@
       <w:r>
         <w:drawing>
           <wp:inline xmlns:a="http://schemas.openxmlformats.org/drawingml/2006/main" xmlns:pic="http://schemas.openxmlformats.org/drawingml/2006/picture">
-            <wp:extent cx="5715000" cy="4167188"/>
+            <wp:extent cx="5669280" cy="4133850"/>
             <wp:docPr id="2" name="Picture 2"/>
             <wp:cNvGraphicFramePr>
               <a:graphicFrameLocks noChangeAspect="1"/>
@@ -3966,7 +3578,7 @@
                   <pic:spPr>
                     <a:xfrm>
                       <a:off x="0" y="0"/>
-                      <a:ext cx="5715000" cy="4167188"/>
+                      <a:ext cx="5669280" cy="4133850"/>
                     </a:xfrm>
                     <a:prstGeom prst="rect"/>
                   </pic:spPr>
@@ -3999,7 +3611,7 @@
       <w:r>
         <w:drawing>
           <wp:inline xmlns:a="http://schemas.openxmlformats.org/drawingml/2006/main" xmlns:pic="http://schemas.openxmlformats.org/drawingml/2006/picture">
-            <wp:extent cx="5715000" cy="4167188"/>
+            <wp:extent cx="5669280" cy="4133850"/>
             <wp:docPr id="3" name="Picture 3"/>
             <wp:cNvGraphicFramePr>
               <a:graphicFrameLocks noChangeAspect="1"/>
@@ -4020,7 +3632,7 @@
                   <pic:spPr>
                     <a:xfrm>
                       <a:off x="0" y="0"/>
-                      <a:ext cx="5715000" cy="4167188"/>
+                      <a:ext cx="5669280" cy="4133850"/>
                     </a:xfrm>
                     <a:prstGeom prst="rect"/>
                   </pic:spPr>
@@ -4053,7 +3665,7 @@
       <w:r>
         <w:drawing>
           <wp:inline xmlns:a="http://schemas.openxmlformats.org/drawingml/2006/main" xmlns:pic="http://schemas.openxmlformats.org/drawingml/2006/picture">
-            <wp:extent cx="5715000" cy="4167188"/>
+            <wp:extent cx="5669280" cy="4133850"/>
             <wp:docPr id="4" name="Picture 4"/>
             <wp:cNvGraphicFramePr>
               <a:graphicFrameLocks noChangeAspect="1"/>
@@ -4074,7 +3686,7 @@
                   <pic:spPr>
                     <a:xfrm>
                       <a:off x="0" y="0"/>
-                      <a:ext cx="5715000" cy="4167188"/>
+                      <a:ext cx="5669280" cy="4133850"/>
                     </a:xfrm>
                     <a:prstGeom prst="rect"/>
                   </pic:spPr>
@@ -4107,7 +3719,7 @@
       <w:r>
         <w:drawing>
           <wp:inline xmlns:a="http://schemas.openxmlformats.org/drawingml/2006/main" xmlns:pic="http://schemas.openxmlformats.org/drawingml/2006/picture">
-            <wp:extent cx="5715000" cy="4167188"/>
+            <wp:extent cx="5669280" cy="4133850"/>
             <wp:docPr id="5" name="Picture 5"/>
             <wp:cNvGraphicFramePr>
               <a:graphicFrameLocks noChangeAspect="1"/>
@@ -4128,7 +3740,7 @@
                   <pic:spPr>
                     <a:xfrm>
                       <a:off x="0" y="0"/>
-                      <a:ext cx="5715000" cy="4167188"/>
+                      <a:ext cx="5669280" cy="4133850"/>
                     </a:xfrm>
                     <a:prstGeom prst="rect"/>
                   </pic:spPr>
@@ -4161,7 +3773,7 @@
       <w:r>
         <w:drawing>
           <wp:inline xmlns:a="http://schemas.openxmlformats.org/drawingml/2006/main" xmlns:pic="http://schemas.openxmlformats.org/drawingml/2006/picture">
-            <wp:extent cx="5715000" cy="5754688"/>
+            <wp:extent cx="5669280" cy="5708650"/>
             <wp:docPr id="6" name="Picture 6"/>
             <wp:cNvGraphicFramePr>
               <a:graphicFrameLocks noChangeAspect="1"/>
@@ -4182,7 +3794,7 @@
                   <pic:spPr>
                     <a:xfrm>
                       <a:off x="0" y="0"/>
-                      <a:ext cx="5715000" cy="5754688"/>
+                      <a:ext cx="5669280" cy="5708650"/>
                     </a:xfrm>
                     <a:prstGeom prst="rect"/>
                   </pic:spPr>
@@ -4215,7 +3827,7 @@
       <w:r>
         <w:drawing>
           <wp:inline xmlns:a="http://schemas.openxmlformats.org/drawingml/2006/main" xmlns:pic="http://schemas.openxmlformats.org/drawingml/2006/picture">
-            <wp:extent cx="5715000" cy="4258469"/>
+            <wp:extent cx="5669280" cy="4224401"/>
             <wp:docPr id="7" name="Picture 7"/>
             <wp:cNvGraphicFramePr>
               <a:graphicFrameLocks noChangeAspect="1"/>
@@ -4236,7 +3848,7 @@
                   <pic:spPr>
                     <a:xfrm>
                       <a:off x="0" y="0"/>
-                      <a:ext cx="5715000" cy="4258469"/>
+                      <a:ext cx="5669280" cy="4224401"/>
                     </a:xfrm>
                     <a:prstGeom prst="rect"/>
                   </pic:spPr>
@@ -4269,7 +3881,7 @@
       <w:r>
         <w:drawing>
           <wp:inline xmlns:a="http://schemas.openxmlformats.org/drawingml/2006/main" xmlns:pic="http://schemas.openxmlformats.org/drawingml/2006/picture">
-            <wp:extent cx="5715000" cy="4167188"/>
+            <wp:extent cx="5669280" cy="4133850"/>
             <wp:docPr id="8" name="Picture 8"/>
             <wp:cNvGraphicFramePr>
               <a:graphicFrameLocks noChangeAspect="1"/>
@@ -4290,7 +3902,7 @@
                   <pic:spPr>
                     <a:xfrm>
                       <a:off x="0" y="0"/>
-                      <a:ext cx="5715000" cy="4167188"/>
+                      <a:ext cx="5669280" cy="4133850"/>
                     </a:xfrm>
                     <a:prstGeom prst="rect"/>
                   </pic:spPr>
@@ -4324,606 +3936,639 @@
           <w:b w:val="0"/>
           <w:i w:val="0"/>
         </w:rPr>
-        <w:t>10. Correspondencia con la rúbrica</w:t>
+        <w:t>10. Cuestionario de verificación de autoría y defensa técnica</w:t>
       </w:r>
-    </w:p>
-    <w:tbl>
-      <w:tblPr>
-        <w:tblStyle w:val="TableGrid"/>
-        <w:tblW w:type="auto" w:w="0"/>
-        <w:jc w:val="center"/>
-        <w:tblLayout w:type="autofit"/>
-        <w:tblLook w:firstColumn="1" w:firstRow="1" w:lastColumn="0" w:lastRow="0" w:noHBand="0" w:noVBand="1" w:val="04A0"/>
-      </w:tblPr>
-      <w:tblGrid>
-        <w:gridCol w:w="4997"/>
-        <w:gridCol w:w="4997"/>
-      </w:tblGrid>
-      <w:tr>
-        <w:tc>
-          <w:tcPr>
-            <w:tcW w:type="dxa" w:w="4997"/>
-            <w:vAlign w:val="center"/>
-            <w:tcMar>
-              <w:top w:w="90" w:type="dxa"/>
-              <w:start w:w="100" w:type="dxa"/>
-              <w:bottom w:w="90" w:type="dxa"/>
-              <w:end w:w="100" w:type="dxa"/>
-            </w:tcMar>
-            <w:shd w:fill="17365D"/>
-          </w:tcPr>
-          <w:p>
-            <w:pPr>
-              <w:spacing w:after="0"/>
-            </w:pPr>
-            <w:r>
-              <w:rPr>
-                <w:b/>
-                <w:color w:val="FFFFFF"/>
-                <w:sz w:val="17"/>
-              </w:rPr>
-            </w:r>
-            <w:r>
-              <w:rPr>
-                <w:b/>
-                <w:i w:val="0"/>
-                <w:color w:val="FFFFFF"/>
-                <w:sz w:val="17"/>
-              </w:rPr>
-              <w:t>Criterio</w:t>
-            </w:r>
-          </w:p>
-        </w:tc>
-        <w:tc>
-          <w:tcPr>
-            <w:tcW w:type="dxa" w:w="4997"/>
-            <w:vAlign w:val="center"/>
-            <w:tcMar>
-              <w:top w:w="90" w:type="dxa"/>
-              <w:start w:w="100" w:type="dxa"/>
-              <w:bottom w:w="90" w:type="dxa"/>
-              <w:end w:w="100" w:type="dxa"/>
-            </w:tcMar>
-            <w:shd w:fill="17365D"/>
-          </w:tcPr>
-          <w:p>
-            <w:pPr>
-              <w:spacing w:after="0"/>
-            </w:pPr>
-            <w:r>
-              <w:rPr>
-                <w:b/>
-                <w:color w:val="FFFFFF"/>
-                <w:sz w:val="17"/>
-              </w:rPr>
-            </w:r>
-            <w:r>
-              <w:rPr>
-                <w:b/>
-                <w:i w:val="0"/>
-                <w:color w:val="FFFFFF"/>
-                <w:sz w:val="17"/>
-              </w:rPr>
-              <w:t>Evidencia que se explica o debe demostrarse</w:t>
-            </w:r>
-          </w:p>
-        </w:tc>
-      </w:tr>
-      <w:tr>
-        <w:tc>
-          <w:tcPr>
-            <w:tcW w:type="dxa" w:w="4997"/>
-            <w:vAlign w:val="center"/>
-            <w:tcMar>
-              <w:top w:w="90" w:type="dxa"/>
-              <w:start w:w="100" w:type="dxa"/>
-              <w:bottom w:w="90" w:type="dxa"/>
-              <w:end w:w="100" w:type="dxa"/>
-            </w:tcMar>
-          </w:tcPr>
-          <w:p>
-            <w:pPr>
-              <w:spacing w:after="0"/>
-            </w:pPr>
-            <w:r>
-              <w:rPr>
-                <w:sz w:val="17"/>
-              </w:rPr>
-            </w:r>
-            <w:r>
-              <w:rPr>
-                <w:b w:val="0"/>
-                <w:i w:val="0"/>
-                <w:sz w:val="17"/>
-              </w:rPr>
-              <w:t>Arquitectura backend y API REST</w:t>
-            </w:r>
-          </w:p>
-        </w:tc>
-        <w:tc>
-          <w:tcPr>
-            <w:tcW w:type="dxa" w:w="4997"/>
-            <w:vAlign w:val="center"/>
-            <w:tcMar>
-              <w:top w:w="90" w:type="dxa"/>
-              <w:start w:w="100" w:type="dxa"/>
-              <w:bottom w:w="90" w:type="dxa"/>
-              <w:end w:w="100" w:type="dxa"/>
-            </w:tcMar>
-          </w:tcPr>
-          <w:p>
-            <w:pPr>
-              <w:spacing w:after="0"/>
-            </w:pPr>
-            <w:r>
-              <w:rPr>
-                <w:sz w:val="17"/>
-              </w:rPr>
-            </w:r>
-            <w:r>
-              <w:rPr>
-                <w:b w:val="0"/>
-                <w:i w:val="0"/>
-                <w:sz w:val="17"/>
-              </w:rPr>
-              <w:t>Separación entre rutas, controladores, modelos y middleware; métodos y códigos HTTP</w:t>
-            </w:r>
-          </w:p>
-        </w:tc>
-      </w:tr>
-      <w:tr>
-        <w:tc>
-          <w:tcPr>
-            <w:tcW w:type="dxa" w:w="4997"/>
-            <w:vAlign w:val="center"/>
-            <w:tcMar>
-              <w:top w:w="90" w:type="dxa"/>
-              <w:start w:w="100" w:type="dxa"/>
-              <w:bottom w:w="90" w:type="dxa"/>
-              <w:end w:w="100" w:type="dxa"/>
-            </w:tcMar>
-            <w:shd w:fill="F5F8FA"/>
-          </w:tcPr>
-          <w:p>
-            <w:pPr>
-              <w:spacing w:after="0"/>
-            </w:pPr>
-            <w:r>
-              <w:rPr>
-                <w:sz w:val="17"/>
-              </w:rPr>
-            </w:r>
-            <w:r>
-              <w:rPr>
-                <w:b w:val="0"/>
-                <w:i w:val="0"/>
-                <w:sz w:val="17"/>
-              </w:rPr>
-              <w:t>Persistencia NoSQL y Mongoose</w:t>
-            </w:r>
-          </w:p>
-        </w:tc>
-        <w:tc>
-          <w:tcPr>
-            <w:tcW w:type="dxa" w:w="4997"/>
-            <w:vAlign w:val="center"/>
-            <w:tcMar>
-              <w:top w:w="90" w:type="dxa"/>
-              <w:start w:w="100" w:type="dxa"/>
-              <w:bottom w:w="90" w:type="dxa"/>
-              <w:end w:w="100" w:type="dxa"/>
-            </w:tcMar>
-            <w:shd w:fill="F5F8FA"/>
-          </w:tcPr>
-          <w:p>
-            <w:pPr>
-              <w:spacing w:after="0"/>
-            </w:pPr>
-            <w:r>
-              <w:rPr>
-                <w:sz w:val="17"/>
-              </w:rPr>
-            </w:r>
-            <w:r>
-              <w:rPr>
-                <w:b w:val="0"/>
-                <w:i w:val="0"/>
-                <w:sz w:val="17"/>
-              </w:rPr>
-              <w:t xml:space="preserve">Referencias con </w:t>
-            </w:r>
-            <w:r>
-              <w:rPr>
-                <w:rFonts w:ascii="Consolas" w:hAnsi="Consolas"/>
-                <w:b w:val="0"/>
-                <w:i w:val="0"/>
-                <w:color w:val="167C80"/>
-                <w:sz w:val="17"/>
-              </w:rPr>
-              <w:t>ObjectId</w:t>
-            </w:r>
-            <w:r>
-              <w:rPr>
-                <w:b w:val="0"/>
-                <w:i w:val="0"/>
-                <w:sz w:val="17"/>
-              </w:rPr>
-              <w:t>/</w:t>
-            </w:r>
-            <w:r>
-              <w:rPr>
-                <w:rFonts w:ascii="Consolas" w:hAnsi="Consolas"/>
-                <w:b w:val="0"/>
-                <w:i w:val="0"/>
-                <w:color w:val="167C80"/>
-                <w:sz w:val="17"/>
-              </w:rPr>
-              <w:t>populate</w:t>
-            </w:r>
-            <w:r>
-              <w:rPr>
-                <w:b w:val="0"/>
-                <w:i w:val="0"/>
-                <w:sz w:val="17"/>
-              </w:rPr>
-              <w:t>, subdocumentos, validaciones e índice de texto</w:t>
-            </w:r>
-          </w:p>
-        </w:tc>
-      </w:tr>
-      <w:tr>
-        <w:tc>
-          <w:tcPr>
-            <w:tcW w:type="dxa" w:w="4997"/>
-            <w:vAlign w:val="center"/>
-            <w:tcMar>
-              <w:top w:w="90" w:type="dxa"/>
-              <w:start w:w="100" w:type="dxa"/>
-              <w:bottom w:w="90" w:type="dxa"/>
-              <w:end w:w="100" w:type="dxa"/>
-            </w:tcMar>
-          </w:tcPr>
-          <w:p>
-            <w:pPr>
-              <w:spacing w:after="0"/>
-            </w:pPr>
-            <w:r>
-              <w:rPr>
-                <w:sz w:val="17"/>
-              </w:rPr>
-            </w:r>
-            <w:r>
-              <w:rPr>
-                <w:b w:val="0"/>
-                <w:i w:val="0"/>
-                <w:sz w:val="17"/>
-              </w:rPr>
-              <w:t>Seguridad JWT y variables de entorno</w:t>
-            </w:r>
-          </w:p>
-        </w:tc>
-        <w:tc>
-          <w:tcPr>
-            <w:tcW w:type="dxa" w:w="4997"/>
-            <w:vAlign w:val="center"/>
-            <w:tcMar>
-              <w:top w:w="90" w:type="dxa"/>
-              <w:start w:w="100" w:type="dxa"/>
-              <w:bottom w:w="90" w:type="dxa"/>
-              <w:end w:w="100" w:type="dxa"/>
-            </w:tcMar>
-          </w:tcPr>
-          <w:p>
-            <w:pPr>
-              <w:spacing w:after="0"/>
-            </w:pPr>
-            <w:r>
-              <w:rPr>
-                <w:sz w:val="17"/>
-              </w:rPr>
-            </w:r>
-            <w:r>
-              <w:rPr>
-                <w:b w:val="0"/>
-                <w:i w:val="0"/>
-                <w:sz w:val="17"/>
-              </w:rPr>
-              <w:t>Firma y verificación del token, roles, bcrypt y configuración fuera del código</w:t>
-            </w:r>
-          </w:p>
-        </w:tc>
-      </w:tr>
-      <w:tr>
-        <w:tc>
-          <w:tcPr>
-            <w:tcW w:type="dxa" w:w="4997"/>
-            <w:vAlign w:val="center"/>
-            <w:tcMar>
-              <w:top w:w="90" w:type="dxa"/>
-              <w:start w:w="100" w:type="dxa"/>
-              <w:bottom w:w="90" w:type="dxa"/>
-              <w:end w:w="100" w:type="dxa"/>
-            </w:tcMar>
-            <w:shd w:fill="F5F8FA"/>
-          </w:tcPr>
-          <w:p>
-            <w:pPr>
-              <w:spacing w:after="0"/>
-            </w:pPr>
-            <w:r>
-              <w:rPr>
-                <w:sz w:val="17"/>
-              </w:rPr>
-            </w:r>
-            <w:r>
-              <w:rPr>
-                <w:b w:val="0"/>
-                <w:i w:val="0"/>
-                <w:sz w:val="17"/>
-              </w:rPr>
-              <w:t>Frontend React SPA</w:t>
-            </w:r>
-          </w:p>
-        </w:tc>
-        <w:tc>
-          <w:tcPr>
-            <w:tcW w:type="dxa" w:w="4997"/>
-            <w:vAlign w:val="center"/>
-            <w:tcMar>
-              <w:top w:w="90" w:type="dxa"/>
-              <w:start w:w="100" w:type="dxa"/>
-              <w:bottom w:w="90" w:type="dxa"/>
-              <w:end w:w="100" w:type="dxa"/>
-            </w:tcMar>
-            <w:shd w:fill="F5F8FA"/>
-          </w:tcPr>
-          <w:p>
-            <w:pPr>
-              <w:spacing w:after="0"/>
-            </w:pPr>
-            <w:r>
-              <w:rPr>
-                <w:sz w:val="17"/>
-              </w:rPr>
-            </w:r>
-            <w:r>
-              <w:rPr>
-                <w:b w:val="0"/>
-                <w:i w:val="0"/>
-                <w:sz w:val="17"/>
-              </w:rPr>
-              <w:t xml:space="preserve">Formularios, rutas protegidas, hooks </w:t>
-            </w:r>
-            <w:r>
-              <w:rPr>
-                <w:rFonts w:ascii="Consolas" w:hAnsi="Consolas"/>
-                <w:b w:val="0"/>
-                <w:i w:val="0"/>
-                <w:color w:val="167C80"/>
-                <w:sz w:val="17"/>
-              </w:rPr>
-              <w:t>useState</w:t>
-            </w:r>
-            <w:r>
-              <w:rPr>
-                <w:b w:val="0"/>
-                <w:i w:val="0"/>
-                <w:sz w:val="17"/>
-              </w:rPr>
-              <w:t>/</w:t>
-            </w:r>
-            <w:r>
-              <w:rPr>
-                <w:rFonts w:ascii="Consolas" w:hAnsi="Consolas"/>
-                <w:b w:val="0"/>
-                <w:i w:val="0"/>
-                <w:color w:val="167C80"/>
-                <w:sz w:val="17"/>
-              </w:rPr>
-              <w:t>useEffect</w:t>
-            </w:r>
-            <w:r>
-              <w:rPr>
-                <w:b w:val="0"/>
-                <w:i w:val="0"/>
-                <w:sz w:val="17"/>
-              </w:rPr>
-              <w:t xml:space="preserve"> y consumo de la API con Axios</w:t>
-            </w:r>
-          </w:p>
-        </w:tc>
-      </w:tr>
-      <w:tr>
-        <w:tc>
-          <w:tcPr>
-            <w:tcW w:type="dxa" w:w="4997"/>
-            <w:vAlign w:val="center"/>
-            <w:tcMar>
-              <w:top w:w="90" w:type="dxa"/>
-              <w:start w:w="100" w:type="dxa"/>
-              <w:bottom w:w="90" w:type="dxa"/>
-              <w:end w:w="100" w:type="dxa"/>
-            </w:tcMar>
-          </w:tcPr>
-          <w:p>
-            <w:pPr>
-              <w:spacing w:after="0"/>
-            </w:pPr>
-            <w:r>
-              <w:rPr>
-                <w:sz w:val="17"/>
-              </w:rPr>
-            </w:r>
-            <w:r>
-              <w:rPr>
-                <w:b w:val="0"/>
-                <w:i w:val="0"/>
-                <w:sz w:val="17"/>
-              </w:rPr>
-              <w:t>Despliegue, repositorio y documentación</w:t>
-            </w:r>
-          </w:p>
-        </w:tc>
-        <w:tc>
-          <w:tcPr>
-            <w:tcW w:type="dxa" w:w="4997"/>
-            <w:vAlign w:val="center"/>
-            <w:tcMar>
-              <w:top w:w="90" w:type="dxa"/>
-              <w:start w:w="100" w:type="dxa"/>
-              <w:bottom w:w="90" w:type="dxa"/>
-              <w:end w:w="100" w:type="dxa"/>
-            </w:tcMar>
-          </w:tcPr>
-          <w:p>
-            <w:pPr>
-              <w:spacing w:after="0"/>
-            </w:pPr>
-            <w:r>
-              <w:rPr>
-                <w:sz w:val="17"/>
-              </w:rPr>
-            </w:r>
-            <w:r>
-              <w:rPr>
-                <w:b w:val="0"/>
-                <w:i w:val="0"/>
-                <w:sz w:val="17"/>
-              </w:rPr>
-              <w:t xml:space="preserve">Pasos de instalación reproducibles, </w:t>
-            </w:r>
-            <w:r>
-              <w:rPr>
-                <w:rFonts w:ascii="Consolas" w:hAnsi="Consolas"/>
-                <w:b w:val="0"/>
-                <w:i w:val="0"/>
-                <w:color w:val="167C80"/>
-                <w:sz w:val="17"/>
-              </w:rPr>
-              <w:t>.env.example</w:t>
-            </w:r>
-            <w:r>
-              <w:rPr>
-                <w:b w:val="0"/>
-                <w:i w:val="0"/>
-                <w:sz w:val="17"/>
-              </w:rPr>
-              <w:t xml:space="preserve">, </w:t>
-            </w:r>
-            <w:r>
-              <w:rPr>
-                <w:rFonts w:ascii="Consolas" w:hAnsi="Consolas"/>
-                <w:b w:val="0"/>
-                <w:i w:val="0"/>
-                <w:color w:val="167C80"/>
-                <w:sz w:val="17"/>
-              </w:rPr>
-              <w:t>package-lock.json</w:t>
-            </w:r>
-            <w:r>
-              <w:rPr>
-                <w:b w:val="0"/>
-                <w:i w:val="0"/>
-                <w:sz w:val="17"/>
-              </w:rPr>
-              <w:t xml:space="preserve"> y ausencia de dependencias vendorizadas</w:t>
-            </w:r>
-          </w:p>
-        </w:tc>
-      </w:tr>
-      <w:tr>
-        <w:tc>
-          <w:tcPr>
-            <w:tcW w:type="dxa" w:w="4997"/>
-            <w:vAlign w:val="center"/>
-            <w:tcMar>
-              <w:top w:w="90" w:type="dxa"/>
-              <w:start w:w="100" w:type="dxa"/>
-              <w:bottom w:w="90" w:type="dxa"/>
-              <w:end w:w="100" w:type="dxa"/>
-            </w:tcMar>
-            <w:shd w:fill="F5F8FA"/>
-          </w:tcPr>
-          <w:p>
-            <w:pPr>
-              <w:spacing w:after="0"/>
-            </w:pPr>
-            <w:r>
-              <w:rPr>
-                <w:sz w:val="17"/>
-              </w:rPr>
-            </w:r>
-            <w:r>
-              <w:rPr>
-                <w:b w:val="0"/>
-                <w:i w:val="0"/>
-                <w:sz w:val="17"/>
-              </w:rPr>
-              <w:t>Defensa y autoría</w:t>
-            </w:r>
-          </w:p>
-        </w:tc>
-        <w:tc>
-          <w:tcPr>
-            <w:tcW w:type="dxa" w:w="4997"/>
-            <w:vAlign w:val="center"/>
-            <w:tcMar>
-              <w:top w:w="90" w:type="dxa"/>
-              <w:start w:w="100" w:type="dxa"/>
-              <w:bottom w:w="90" w:type="dxa"/>
-              <w:end w:w="100" w:type="dxa"/>
-            </w:tcMar>
-            <w:shd w:fill="F5F8FA"/>
-          </w:tcPr>
-          <w:p>
-            <w:pPr>
-              <w:spacing w:after="0"/>
-            </w:pPr>
-            <w:r>
-              <w:rPr>
-                <w:sz w:val="17"/>
-              </w:rPr>
-            </w:r>
-            <w:r>
-              <w:rPr>
-                <w:b w:val="0"/>
-                <w:i w:val="0"/>
-                <w:sz w:val="17"/>
-              </w:rPr>
-              <w:t>Explicar el recorrido de una petición, por qué se combinan referencias y subdocumentos y qué contiene el JWT</w:t>
-            </w:r>
-          </w:p>
-        </w:tc>
-      </w:tr>
-    </w:tbl>
-    <w:p>
-      <w:pPr>
-        <w:spacing w:after="0"/>
-      </w:pPr>
     </w:p>
     <w:p>
       <w:pPr>
-        <w:pStyle w:val="Heading2"/>
+        <w:pStyle w:val="Heading3"/>
       </w:pPr>
       <w:r>
         <w:rPr>
           <w:b w:val="0"/>
           <w:i w:val="0"/>
         </w:rPr>
-        <w:t>11. Guion oral sugerido</w:t>
+        <w:t>1. Flujo integral de autenticación</w:t>
+      </w:r>
+    </w:p>
+    <w:p>
+      <w:r>
+        <w:rPr>
+          <w:b/>
+          <w:i w:val="0"/>
+        </w:rPr>
+        <w:t>Pregunta:</w:t>
+      </w:r>
+      <w:r>
+        <w:rPr>
+          <w:b w:val="0"/>
+          <w:i w:val="0"/>
+        </w:rPr>
+        <w:t xml:space="preserve"> Explique el ciclo de vida de la autenticación: desde el ingreso de credenciales en React, la generación del JWT en el backend, hasta el envío de </w:t>
+      </w:r>
+      <w:r>
+        <w:rPr>
+          <w:rFonts w:ascii="Consolas" w:hAnsi="Consolas"/>
+          <w:b w:val="0"/>
+          <w:i w:val="0"/>
+          <w:color w:val="167C80"/>
+          <w:sz w:val="18"/>
+        </w:rPr>
+        <w:t>Authorization: Bearer &lt;token&gt;</w:t>
+      </w:r>
+      <w:r>
+        <w:rPr>
+          <w:b w:val="0"/>
+          <w:i w:val="0"/>
+        </w:rPr>
+        <w:t xml:space="preserve"> y la validación en una ruta protegida.</w:t>
+      </w:r>
+    </w:p>
+    <w:p>
+      <w:r>
+        <w:rPr>
+          <w:b/>
+          <w:i w:val="0"/>
+        </w:rPr>
+        <w:t>Respuesta:</w:t>
+      </w:r>
+      <w:r>
+        <w:rPr>
+          <w:b w:val="0"/>
+          <w:i w:val="0"/>
+        </w:rPr>
+        <w:t xml:space="preserve"> En el registro o inicio de sesión, React envía el correo y la contraseña a </w:t>
+      </w:r>
+      <w:r>
+        <w:rPr>
+          <w:rFonts w:ascii="Consolas" w:hAnsi="Consolas"/>
+          <w:b w:val="0"/>
+          <w:i w:val="0"/>
+          <w:color w:val="167C80"/>
+          <w:sz w:val="18"/>
+        </w:rPr>
+        <w:t>POST /api/auth/register</w:t>
+      </w:r>
+      <w:r>
+        <w:rPr>
+          <w:b w:val="0"/>
+          <w:i w:val="0"/>
+        </w:rPr>
+        <w:t xml:space="preserve"> o </w:t>
+      </w:r>
+      <w:r>
+        <w:rPr>
+          <w:rFonts w:ascii="Consolas" w:hAnsi="Consolas"/>
+          <w:b w:val="0"/>
+          <w:i w:val="0"/>
+          <w:color w:val="167C80"/>
+          <w:sz w:val="18"/>
+        </w:rPr>
+        <w:t>POST /api/auth/login</w:t>
+      </w:r>
+      <w:r>
+        <w:rPr>
+          <w:b w:val="0"/>
+          <w:i w:val="0"/>
+        </w:rPr>
+        <w:t xml:space="preserve">. El backend comprueba los datos; en el inicio de sesión compara la contraseña con su hash bcrypt. Si son válidos, </w:t>
+      </w:r>
+      <w:r>
+        <w:rPr>
+          <w:rFonts w:ascii="Consolas" w:hAnsi="Consolas"/>
+          <w:b w:val="0"/>
+          <w:i w:val="0"/>
+          <w:color w:val="167C80"/>
+          <w:sz w:val="18"/>
+        </w:rPr>
+        <w:t>generateToken</w:t>
+      </w:r>
+      <w:r>
+        <w:rPr>
+          <w:b w:val="0"/>
+          <w:i w:val="0"/>
+        </w:rPr>
+        <w:t xml:space="preserve"> firma un JWT con el identificador de usuario y una fecha de expiración. El frontend guarda el token en </w:t>
+      </w:r>
+      <w:r>
+        <w:rPr>
+          <w:rFonts w:ascii="Consolas" w:hAnsi="Consolas"/>
+          <w:b w:val="0"/>
+          <w:i w:val="0"/>
+          <w:color w:val="167C80"/>
+          <w:sz w:val="18"/>
+        </w:rPr>
+        <w:t>localStorage</w:t>
+      </w:r>
+      <w:r>
+        <w:rPr>
+          <w:b w:val="0"/>
+          <w:i w:val="0"/>
+        </w:rPr>
+        <w:t xml:space="preserve">. El cliente Axios lo agrega a las solicitudes protegidas como </w:t>
+      </w:r>
+      <w:r>
+        <w:rPr>
+          <w:rFonts w:ascii="Consolas" w:hAnsi="Consolas"/>
+          <w:b w:val="0"/>
+          <w:i w:val="0"/>
+          <w:color w:val="167C80"/>
+          <w:sz w:val="18"/>
+        </w:rPr>
+        <w:t>Authorization: Bearer &lt;token&gt;</w:t>
+      </w:r>
+      <w:r>
+        <w:rPr>
+          <w:b w:val="0"/>
+          <w:i w:val="0"/>
+        </w:rPr>
+        <w:t xml:space="preserve">. En el middleware </w:t>
+      </w:r>
+      <w:r>
+        <w:rPr>
+          <w:rFonts w:ascii="Consolas" w:hAnsi="Consolas"/>
+          <w:b w:val="0"/>
+          <w:i w:val="0"/>
+          <w:color w:val="167C80"/>
+          <w:sz w:val="18"/>
+        </w:rPr>
+        <w:t>protect</w:t>
+      </w:r>
+      <w:r>
+        <w:rPr>
+          <w:b w:val="0"/>
+          <w:i w:val="0"/>
+        </w:rPr>
+        <w:t xml:space="preserve">, el backend extrae el token, ejecuta </w:t>
+      </w:r>
+      <w:r>
+        <w:rPr>
+          <w:rFonts w:ascii="Consolas" w:hAnsi="Consolas"/>
+          <w:b w:val="0"/>
+          <w:i w:val="0"/>
+          <w:color w:val="167C80"/>
+          <w:sz w:val="18"/>
+        </w:rPr>
+        <w:t>jwt.verify</w:t>
+      </w:r>
+      <w:r>
+        <w:rPr>
+          <w:b w:val="0"/>
+          <w:i w:val="0"/>
+        </w:rPr>
+        <w:t xml:space="preserve"> con </w:t>
+      </w:r>
+      <w:r>
+        <w:rPr>
+          <w:rFonts w:ascii="Consolas" w:hAnsi="Consolas"/>
+          <w:b w:val="0"/>
+          <w:i w:val="0"/>
+          <w:color w:val="167C80"/>
+          <w:sz w:val="18"/>
+        </w:rPr>
+        <w:t>JWT_SECRET</w:t>
+      </w:r>
+      <w:r>
+        <w:rPr>
+          <w:b w:val="0"/>
+          <w:i w:val="0"/>
+        </w:rPr>
+        <w:t xml:space="preserve">, busca al usuario correspondiente y continúa la solicitud solo si el token es válido y la cuenta está activa. Después, </w:t>
+      </w:r>
+      <w:r>
+        <w:rPr>
+          <w:rFonts w:ascii="Consolas" w:hAnsi="Consolas"/>
+          <w:b w:val="0"/>
+          <w:i w:val="0"/>
+          <w:color w:val="167C80"/>
+          <w:sz w:val="18"/>
+        </w:rPr>
+        <w:t>authorize</w:t>
+      </w:r>
+      <w:r>
+        <w:rPr>
+          <w:b w:val="0"/>
+          <w:i w:val="0"/>
+        </w:rPr>
+        <w:t xml:space="preserve"> comprueba los permisos de rol cuando la ruta lo requiere.</w:t>
       </w:r>
     </w:p>
     <w:p>
       <w:pPr>
-        <w:pStyle w:val="Quote"/>
-        <w:ind w:left="360"/>
+        <w:pStyle w:val="Heading3"/>
       </w:pPr>
       <w:r>
         <w:rPr>
           <w:b w:val="0"/>
           <w:i w:val="0"/>
         </w:rPr>
-        <w:t>Buenos días. Soy Eva Lizeth Chino Quispe y voy a presentar EducaVault, una aplicación web para organizar el seguimiento de tesis y trabajos de grado. La idea principal es reunir en un mismo lugar el estado del trabajo, sus versiones y las observaciones de quienes participan en la revisión.</w:t>
+        <w:t>2. Justificación del modelado NoSQL con Mongoose</w:t>
+      </w:r>
+    </w:p>
+    <w:p>
+      <w:r>
+        <w:rPr>
+          <w:b/>
+          <w:i w:val="0"/>
+        </w:rPr>
+        <w:t>Pregunta:</w:t>
+      </w:r>
+      <w:r>
+        <w:rPr>
+          <w:b w:val="0"/>
+          <w:i w:val="0"/>
+        </w:rPr>
+        <w:t xml:space="preserve"> ¿Qué colecciones estableció y por qué utilizó referencias cruzadas en lugar de embeber todos los datos? Explique el efecto en escalabilidad y consistencia.</w:t>
+      </w:r>
+    </w:p>
+    <w:p>
+      <w:r>
+        <w:rPr>
+          <w:b/>
+          <w:i w:val="0"/>
+        </w:rPr>
+        <w:t>Respuesta:</w:t>
+      </w:r>
+      <w:r>
+        <w:rPr>
+          <w:b w:val="0"/>
+          <w:i w:val="0"/>
+        </w:rPr>
+        <w:t xml:space="preserve"> El sistema utiliza las colecciones </w:t>
+      </w:r>
+      <w:r>
+        <w:rPr>
+          <w:rFonts w:ascii="Consolas" w:hAnsi="Consolas"/>
+          <w:b w:val="0"/>
+          <w:i w:val="0"/>
+          <w:color w:val="167C80"/>
+          <w:sz w:val="18"/>
+        </w:rPr>
+        <w:t>users</w:t>
+      </w:r>
+      <w:r>
+        <w:rPr>
+          <w:b w:val="0"/>
+          <w:i w:val="0"/>
+        </w:rPr>
+        <w:t xml:space="preserve"> y </w:t>
+      </w:r>
+      <w:r>
+        <w:rPr>
+          <w:rFonts w:ascii="Consolas" w:hAnsi="Consolas"/>
+          <w:b w:val="0"/>
+          <w:i w:val="0"/>
+          <w:color w:val="167C80"/>
+          <w:sz w:val="18"/>
+        </w:rPr>
+        <w:t>theses</w:t>
+      </w:r>
+      <w:r>
+        <w:rPr>
+          <w:b w:val="0"/>
+          <w:i w:val="0"/>
+        </w:rPr>
+        <w:t xml:space="preserve">. La tesis referencia mediante </w:t>
+      </w:r>
+      <w:r>
+        <w:rPr>
+          <w:rFonts w:ascii="Consolas" w:hAnsi="Consolas"/>
+          <w:b w:val="0"/>
+          <w:i w:val="0"/>
+          <w:color w:val="167C80"/>
+          <w:sz w:val="18"/>
+        </w:rPr>
+        <w:t>ObjectId</w:t>
+      </w:r>
+      <w:r>
+        <w:rPr>
+          <w:b w:val="0"/>
+          <w:i w:val="0"/>
+        </w:rPr>
+        <w:t xml:space="preserve"> al estudiante, los asesores y el tribunal. Así, cada usuario mantiene un único perfil y los cambios a sus datos no requieren actualizar todas sus tesis. Las consultas usan </w:t>
+      </w:r>
+      <w:r>
+        <w:rPr>
+          <w:rFonts w:ascii="Consolas" w:hAnsi="Consolas"/>
+          <w:b w:val="0"/>
+          <w:i w:val="0"/>
+          <w:color w:val="167C80"/>
+          <w:sz w:val="18"/>
+        </w:rPr>
+        <w:t>populate</w:t>
+      </w:r>
+      <w:r>
+        <w:rPr>
+          <w:b w:val="0"/>
+          <w:i w:val="0"/>
+        </w:rPr>
+        <w:t xml:space="preserve"> para obtener los datos de usuario que la pantalla necesita. Las versiones y revisiones sí se guardan como subdocumentos de la tesis, porque pertenecen a su historial y suelen consultarse junto con ella. Esta combinación reduce la duplicación de perfiles y mantiene juntos los datos propios del ciclo de vida de una tesis.</w:t>
+      </w:r>
+    </w:p>
+    <w:p>
+      <w:pPr>
+        <w:pStyle w:val="Heading3"/>
+      </w:pPr>
+      <w:r>
+        <w:rPr>
+          <w:b w:val="0"/>
+          <w:i w:val="0"/>
+        </w:rPr>
+        <w:t>3. Manejo seguro de secretos y configuración</w:t>
+      </w:r>
+    </w:p>
+    <w:p>
+      <w:r>
+        <w:rPr>
+          <w:b/>
+          <w:i w:val="0"/>
+        </w:rPr>
+        <w:t>Pregunta:</w:t>
+      </w:r>
+      <w:r>
+        <w:rPr>
+          <w:b w:val="0"/>
+          <w:i w:val="0"/>
+        </w:rPr>
+        <w:t xml:space="preserve"> ¿Por qué es mala práctica escribir contraseñas de base de datos o secretos JWT directamente en el código? ¿Cómo ayudan </w:t>
+      </w:r>
+      <w:r>
+        <w:rPr>
+          <w:rFonts w:ascii="Consolas" w:hAnsi="Consolas"/>
+          <w:b w:val="0"/>
+          <w:i w:val="0"/>
+          <w:color w:val="167C80"/>
+          <w:sz w:val="18"/>
+        </w:rPr>
+        <w:t>dotenv</w:t>
+      </w:r>
+      <w:r>
+        <w:rPr>
+          <w:b w:val="0"/>
+          <w:i w:val="0"/>
+        </w:rPr>
+        <w:t xml:space="preserve"> y </w:t>
+      </w:r>
+      <w:r>
+        <w:rPr>
+          <w:rFonts w:ascii="Consolas" w:hAnsi="Consolas"/>
+          <w:b w:val="0"/>
+          <w:i w:val="0"/>
+          <w:color w:val="167C80"/>
+          <w:sz w:val="18"/>
+        </w:rPr>
+        <w:t>.gitignore</w:t>
+      </w:r>
+      <w:r>
+        <w:rPr>
+          <w:b w:val="0"/>
+          <w:i w:val="0"/>
+        </w:rPr>
+        <w:t>?</w:t>
+      </w:r>
+    </w:p>
+    <w:p>
+      <w:r>
+        <w:rPr>
+          <w:b/>
+          <w:i w:val="0"/>
+        </w:rPr>
+        <w:t>Respuesta:</w:t>
+      </w:r>
+      <w:r>
+        <w:rPr>
+          <w:b w:val="0"/>
+          <w:i w:val="0"/>
+        </w:rPr>
+        <w:t xml:space="preserve"> Un secreto escrito en el código puede terminar en Git, en copias del repositorio o en registros compartidos; alguien que lo obtenga podría conectarse a la base de datos o firmar tokens. EducaVault carga la configuración con </w:t>
+      </w:r>
+      <w:r>
+        <w:rPr>
+          <w:rFonts w:ascii="Consolas" w:hAnsi="Consolas"/>
+          <w:b w:val="0"/>
+          <w:i w:val="0"/>
+          <w:color w:val="167C80"/>
+          <w:sz w:val="18"/>
+        </w:rPr>
+        <w:t>require('dotenv').config()</w:t>
+      </w:r>
+      <w:r>
+        <w:rPr>
+          <w:b w:val="0"/>
+          <w:i w:val="0"/>
+        </w:rPr>
+        <w:t xml:space="preserve"> y lee </w:t>
+      </w:r>
+      <w:r>
+        <w:rPr>
+          <w:rFonts w:ascii="Consolas" w:hAnsi="Consolas"/>
+          <w:b w:val="0"/>
+          <w:i w:val="0"/>
+          <w:color w:val="167C80"/>
+          <w:sz w:val="18"/>
+        </w:rPr>
+        <w:t>MONGODB_URI</w:t>
+      </w:r>
+      <w:r>
+        <w:rPr>
+          <w:b w:val="0"/>
+          <w:i w:val="0"/>
+        </w:rPr>
+        <w:t xml:space="preserve"> y </w:t>
+      </w:r>
+      <w:r>
+        <w:rPr>
+          <w:rFonts w:ascii="Consolas" w:hAnsi="Consolas"/>
+          <w:b w:val="0"/>
+          <w:i w:val="0"/>
+          <w:color w:val="167C80"/>
+          <w:sz w:val="18"/>
+        </w:rPr>
+        <w:t>JWT_SECRET</w:t>
+      </w:r>
+      <w:r>
+        <w:rPr>
+          <w:b w:val="0"/>
+          <w:i w:val="0"/>
+        </w:rPr>
+        <w:t xml:space="preserve"> desde </w:t>
+      </w:r>
+      <w:r>
+        <w:rPr>
+          <w:rFonts w:ascii="Consolas" w:hAnsi="Consolas"/>
+          <w:b w:val="0"/>
+          <w:i w:val="0"/>
+          <w:color w:val="167C80"/>
+          <w:sz w:val="18"/>
+        </w:rPr>
+        <w:t>process.env</w:t>
+      </w:r>
+      <w:r>
+        <w:rPr>
+          <w:b w:val="0"/>
+          <w:i w:val="0"/>
+        </w:rPr>
+        <w:t xml:space="preserve">. El archivo </w:t>
+      </w:r>
+      <w:r>
+        <w:rPr>
+          <w:rFonts w:ascii="Consolas" w:hAnsi="Consolas"/>
+          <w:b w:val="0"/>
+          <w:i w:val="0"/>
+          <w:color w:val="167C80"/>
+          <w:sz w:val="18"/>
+        </w:rPr>
+        <w:t>.gitignore</w:t>
+      </w:r>
+      <w:r>
+        <w:rPr>
+          <w:b w:val="0"/>
+          <w:i w:val="0"/>
+        </w:rPr>
+        <w:t xml:space="preserve"> excluye </w:t>
+      </w:r>
+      <w:r>
+        <w:rPr>
+          <w:rFonts w:ascii="Consolas" w:hAnsi="Consolas"/>
+          <w:b w:val="0"/>
+          <w:i w:val="0"/>
+          <w:color w:val="167C80"/>
+          <w:sz w:val="18"/>
+        </w:rPr>
+        <w:t>.env</w:t>
+      </w:r>
+      <w:r>
+        <w:rPr>
+          <w:b w:val="0"/>
+          <w:i w:val="0"/>
+        </w:rPr>
+        <w:t xml:space="preserve">, por lo que las credenciales locales no se agregan al repositorio. Se comparte solamente </w:t>
+      </w:r>
+      <w:r>
+        <w:rPr>
+          <w:rFonts w:ascii="Consolas" w:hAnsi="Consolas"/>
+          <w:b w:val="0"/>
+          <w:i w:val="0"/>
+          <w:color w:val="167C80"/>
+          <w:sz w:val="18"/>
+        </w:rPr>
+        <w:t>.env.example</w:t>
+      </w:r>
+      <w:r>
+        <w:rPr>
+          <w:b w:val="0"/>
+          <w:i w:val="0"/>
+        </w:rPr>
+        <w:t xml:space="preserve"> con valores de ejemplo, que deben reemplazarse localmente. </w:t>
+      </w:r>
+      <w:r>
+        <w:rPr>
+          <w:rFonts w:ascii="Consolas" w:hAnsi="Consolas"/>
+          <w:b w:val="0"/>
+          <w:i w:val="0"/>
+          <w:color w:val="167C80"/>
+          <w:sz w:val="18"/>
+        </w:rPr>
+        <w:t>dotenv</w:t>
+      </w:r>
+      <w:r>
+        <w:rPr>
+          <w:b w:val="0"/>
+          <w:i w:val="0"/>
+        </w:rPr>
+        <w:t xml:space="preserve"> facilita separar configuración y código, pero la protección depende de no publicar el archivo real y de usar secretos fuertes.</w:t>
+      </w:r>
+    </w:p>
+    <w:p>
+      <w:pPr>
+        <w:pStyle w:val="Heading3"/>
+      </w:pPr>
+      <w:r>
+        <w:rPr>
+          <w:b w:val="0"/>
+          <w:i w:val="0"/>
+        </w:rPr>
+        <w:t>4. Trazabilidad de código y autoría</w:t>
+      </w:r>
+    </w:p>
+    <w:p>
+      <w:r>
+        <w:rPr>
+          <w:b/>
+          <w:i w:val="0"/>
+        </w:rPr>
+        <w:t>Pregunta:</w:t>
+      </w:r>
+      <w:r>
+        <w:rPr>
+          <w:b w:val="0"/>
+          <w:i w:val="0"/>
+        </w:rPr>
+        <w:t xml:space="preserve"> Identifique y transcriba una línea exacta del backend donde se emite o verifica el JWT. Explique qué contiene el payload y por qué no debe guardar contraseñas, incluso con hash.</w:t>
+      </w:r>
+    </w:p>
+    <w:p>
+      <w:r>
+        <w:rPr>
+          <w:b/>
+          <w:i w:val="0"/>
+        </w:rPr>
+        <w:t>Respuesta:</w:t>
+      </w:r>
+      <w:r>
+        <w:rPr>
+          <w:b w:val="0"/>
+          <w:i w:val="0"/>
+        </w:rPr>
+        <w:t xml:space="preserve"> En </w:t>
+      </w:r>
+      <w:r>
+        <w:rPr>
+          <w:rFonts w:ascii="Consolas" w:hAnsi="Consolas"/>
+          <w:b w:val="0"/>
+          <w:i w:val="0"/>
+          <w:color w:val="167C80"/>
+          <w:sz w:val="18"/>
+        </w:rPr>
+        <w:t>backend/src/controllers/authController.js</w:t>
+      </w:r>
+      <w:r>
+        <w:rPr>
+          <w:b w:val="0"/>
+          <w:i w:val="0"/>
+        </w:rPr>
+        <w:t xml:space="preserve">, </w:t>
+      </w:r>
+      <w:r>
+        <w:rPr>
+          <w:rFonts w:ascii="Consolas" w:hAnsi="Consolas"/>
+          <w:b w:val="0"/>
+          <w:i w:val="0"/>
+          <w:color w:val="167C80"/>
+          <w:sz w:val="18"/>
+        </w:rPr>
+        <w:t>generateToken</w:t>
+      </w:r>
+      <w:r>
+        <w:rPr>
+          <w:b w:val="0"/>
+          <w:i w:val="0"/>
+        </w:rPr>
+        <w:t xml:space="preserve"> emite el token con esta línea:</w:t>
+      </w:r>
+    </w:p>
+    <w:p>
+      <w:pPr>
+        <w:spacing w:before="60" w:after="160"/>
+        <w:ind w:left="173" w:right="173"/>
+        <w:shd w:fill="F3F5F7"/>
+      </w:pPr>
+      <w:r>
+        <w:rPr>
+          <w:rFonts w:ascii="Consolas" w:hAnsi="Consolas"/>
+          <w:sz w:val="17"/>
+        </w:rPr>
+        <w:t>return jwt.sign({ id }, process.env.JWT_SECRET, {</w:t>
       </w:r>
     </w:p>
     <w:p>
@@ -4932,32 +4577,89 @@
           <w:b w:val="0"/>
           <w:i w:val="0"/>
         </w:rPr>
-        <w:t>&gt;</w:t>
+        <w:t>El payload propio contiene el identificador del usuario (</w:t>
       </w:r>
-    </w:p>
-    <w:p>
-      <w:pPr>
-        <w:pStyle w:val="Quote"/>
-        <w:ind w:left="360"/>
-      </w:pPr>
+      <w:r>
+        <w:rPr>
+          <w:rFonts w:ascii="Consolas" w:hAnsi="Consolas"/>
+          <w:b w:val="0"/>
+          <w:i w:val="0"/>
+          <w:color w:val="167C80"/>
+          <w:sz w:val="18"/>
+        </w:rPr>
+        <w:t>id</w:t>
+      </w:r>
       <w:r>
         <w:rPr>
           <w:b w:val="0"/>
           <w:i w:val="0"/>
         </w:rPr>
-        <w:t>Separé la aplicación en una interfaz React, una API REST con Express y una base MongoDB. Los perfiles de usuario se relacionan con la tesis mediante referencias, mientras que las versiones y las revisiones se guardan dentro del documento de tesis porque se consultan como parte de su historial. Para la demostración voy a iniciar como estudiante, crear o abrir una tesis y mostrar su nueva versión; después explicaré cómo el tribunal asignado registra una revisión. Las contraseñas se guardan como hash y la API verifica el JWT y los permisos. En este prototipo se guardan los datos del archivo, no su contenido binario.</w:t>
+        <w:t xml:space="preserve">); la librería añade las marcas de tiempo del token, como </w:t>
       </w:r>
-    </w:p>
-    <w:p>
-      <w:pPr>
-        <w:pStyle w:val="Heading2"/>
-      </w:pPr>
+      <w:r>
+        <w:rPr>
+          <w:rFonts w:ascii="Consolas" w:hAnsi="Consolas"/>
+          <w:b w:val="0"/>
+          <w:i w:val="0"/>
+          <w:color w:val="167C80"/>
+          <w:sz w:val="18"/>
+        </w:rPr>
+        <w:t>iat</w:t>
+      </w:r>
       <w:r>
         <w:rPr>
           <w:b w:val="0"/>
           <w:i w:val="0"/>
         </w:rPr>
-        <w:t>12. Cierre</w:t>
+        <w:t xml:space="preserve"> y </w:t>
+      </w:r>
+      <w:r>
+        <w:rPr>
+          <w:rFonts w:ascii="Consolas" w:hAnsi="Consolas"/>
+          <w:b w:val="0"/>
+          <w:i w:val="0"/>
+          <w:color w:val="167C80"/>
+          <w:sz w:val="18"/>
+        </w:rPr>
+        <w:t>exp</w:t>
+      </w:r>
+      <w:r>
+        <w:rPr>
+          <w:b w:val="0"/>
+          <w:i w:val="0"/>
+        </w:rPr>
+        <w:t xml:space="preserve">, según la firma y su expiración configurada. La verificación se realiza en </w:t>
+      </w:r>
+      <w:r>
+        <w:rPr>
+          <w:rFonts w:ascii="Consolas" w:hAnsi="Consolas"/>
+          <w:b w:val="0"/>
+          <w:i w:val="0"/>
+          <w:color w:val="167C80"/>
+          <w:sz w:val="18"/>
+        </w:rPr>
+        <w:t>backend/src/middleware/auth.js</w:t>
+      </w:r>
+      <w:r>
+        <w:rPr>
+          <w:b w:val="0"/>
+          <w:i w:val="0"/>
+        </w:rPr>
+        <w:t>:</w:t>
+      </w:r>
+    </w:p>
+    <w:p>
+      <w:pPr>
+        <w:spacing w:before="60" w:after="160"/>
+        <w:ind w:left="173" w:right="173"/>
+        <w:shd w:fill="F3F5F7"/>
+      </w:pPr>
+      <w:r>
+        <w:rPr>
+          <w:rFonts w:ascii="Consolas" w:hAnsi="Consolas"/>
+          <w:sz w:val="17"/>
+        </w:rPr>
+        <w:t>const decoded = jwt.verify(token, process.env.JWT_SECRET);</w:t>
       </w:r>
     </w:p>
     <w:p>
@@ -4966,14 +4668,14 @@
           <w:b w:val="0"/>
           <w:i w:val="0"/>
         </w:rPr>
-        <w:t>EducaVault propone un flujo digital sencillo para dar seguimiento a trabajos de grado y conservar su historial. La separación por capas, el modelado mixto de MongoDB y la autenticación por roles responden a las necesidades principales del sistema. En la exposición, cada decisión se puede relacionar con una pantalla y con la parte del código que la implementa.</w:t>
+        <w:t>El token está firmado, pero no cifrado: quien lo obtiene puede leer su payload. Por eso no se incluyen contraseñas ni hashes; ambos son información sensible, y un hash expuesto puede facilitar ataques de fuerza bruta. En este proyecto, después de verificar el token, el backend recupera el usuario desde MongoDB sin seleccionar el campo de contraseña.</w:t>
       </w:r>
     </w:p>
     <w:sectPr>
       <w:headerReference w:type="default" r:id="rId9"/>
       <w:footerReference w:type="default" r:id="rId10"/>
       <w:pgSz w:w="12240" w:h="15840"/>
-      <w:pgMar w:top="1037" w:right="1123" w:bottom="1037" w:left="1123" w:header="720" w:footer="720" w:gutter="0"/>
+      <w:pgMar w:top="1008" w:right="1152" w:bottom="1008" w:left="1152" w:header="720" w:footer="720" w:gutter="0"/>
       <w:cols w:space="720"/>
       <w:docGrid w:linePitch="360"/>
     </w:sectPr>
@@ -5008,7 +4710,6 @@
     </w:pPr>
     <w:r>
       <w:rPr>
-        <w:rFonts w:ascii="Aptos" w:hAnsi="Aptos"/>
         <w:b/>
         <w:color w:val="167C80"/>
         <w:sz w:val="16"/>
@@ -5746,7 +5447,7 @@
       <w:color w:val="17365D"/>
       <w:spacing w:val="5"/>
       <w:kern w:val="28"/>
-      <w:sz w:val="48"/>
+      <w:sz w:val="46"/>
       <w:szCs w:val="52"/>
     </w:rPr>
   </w:style>

</xml_diff>